<commit_message>
docs: complete tfm.docx with Phase 7-17 content, results, conclusions, annex A
Fill all remaining placeholders in tfm.docx: Spanish/English abstracts and
keywords, Chapter 2 subsections for Phases 7-17, full Chapter 3 Results
(extended dataset suite, readiness scores, impact analysis, unified leakage
risk score validation, semantic LLM evaluation, quantitative benchmark,
real-world case studies, discussion), Chapter 4 conclusions and future
research lines, bibliography entries [14]-[19], and Annex A (ethical,
economic, social and environmental aspects).

Co-Authored-By: Claude Sonnet 4.6 <noreply@anthropic.com>
</commit_message>
<xml_diff>
--- a/tfm.docx
+++ b/tfm.docx
@@ -1600,15 +1600,25 @@
           <w:szCs w:val="24"/>
           <w:lang w:val="es-ES"/>
         </w:rPr>
-        <w:t>Número máximo de palabras: 500</w:t>
-      </w:r>
-      <w:r>
-        <w:rPr>
-          <w:sz w:val="24"/>
-          <w:szCs w:val="24"/>
-          <w:lang w:val="es-ES"/>
-        </w:rPr>
-        <w:t>…</w:t>
+        <w:t>El aprendizaje automático (Machine Learning, ML) se ha convertido en una tecnología central en numerosos dominios de alto impacto, como la sanidad, las finanzas o los sistemas de recomendación. Sin embargo, la fiabilidad de los modelos entrenados depende de manera crítica de la calidad de los datos utilizados durante el proceso de entrenamiento. Dos problemas especialmente dañinos y frecuentemente pasados por alto son, por un lado, los defectos de calidad de los datos —como valores faltantes, filas duplicadas, desequilibrio de clases, valores atípicos o características de varianza casi nula— y, por otro, la fuga de datos (data leakage), que se produce cuando información que no estaría disponible en el momento de la predicción se filtra de forma inadvertida en el proceso de entrenamiento, inflando artificialmente las métricas de evaluación.</w:t>
+      </w:r>
+    </w:p>
+    <w:p>
+      <w:pPr/>
+      <w:r>
+        <w:t>En este Trabajo Fin de Máster se presenta ml-framework, un sistema de código abierto, modular y configurable mediante YAML, para la evaluación automática de la calidad de conjuntos de datos y la detección de fuga de datos en flujos de trabajo de aprendizaje automático. El framework implementa un pipeline secuencial de hasta 22 comprobaciones organizadas en seis dimensiones: calidad de los datos, fuga de datos, análisis de características, suficiencia estadística, detección de deriva (drift) e impacto sobre el rendimiento del modelo. El sistema es accesible mediante tres interfaces —una herramienta de línea de comandos, un SDK de Python (clase DatasetChecker) y una aplicación web interactiva basada en Streamlit— y admite la incorporación de comprobaciones personalizadas mediante un sistema de plugins.</w:t>
+      </w:r>
+    </w:p>
+    <w:p>
+      <w:pPr/>
+      <w:r>
+        <w:t>La contribución metodológica más novedosa es la puntuación unificada de riesgo de fuga, L(f) = 0.35·ρ(f) + 0.35·Ĩ(f;y) + 0.30·π(f), que combina en una única métrica interpretable la correlación de Pearson o el coeficiente V de Cramér, la información mutua normalizada y la inflación del rendimiento del modelo atribuible a cada característica. De forma complementaria, se ha desarrollado un módulo de análisis semántico basado en el modelo GPT-4o-mini (a través de Azure OpenAI), capaz de detectar fuga semántica: casos en los que el propio nombre o la descripción de una variable revela información temporal, indirecta o posterior al evento (post hoc) que los métodos puramente estadísticos no pueden capturar.</w:t>
+      </w:r>
+    </w:p>
+    <w:p>
+      <w:pPr/>
+      <w:r>
+        <w:t>El framework se ha evaluado sobre doce conjuntos de datos —seis sintéticos generados de forma controlada y seis procedentes de OpenML / UCI (Titanic, Pima Diabetes, Adult Census Income, German Credit, Heart Disease y Wine Quality)—, alcanzando una tasa de detección de 4 sobre 4 en los escenarios de fuga construidos deliberadamente, y puntuaciones de disponibilidad (readiness score) calibradas que van de 65 puntos (grado C, conjunto de datos sucio) a 95 puntos (grado A, conjunto de control limpio). Un benchmark cuantitativo frente a tres herramientas de referencia (Deepchecks, Great Expectations e ydata-profiling) muestra que ml-framework cubre 29 de 29 aspectos evaluados, frente a un máximo de 11 de 29 de la mejor alternativa, y detecta 4 de 4 escenarios de fuga frente a 0–1 del resto. El módulo semántico, evaluado sobre un benchmark de 30 características etiquetadas manualmente, alcanza una precisión de 1.00 y una exhaustividad (recall) de 0.93 (F1 = 0.96). Adicionalmente, se documentan tres casos de estudio reales (Titanic, Adult Census y German Credit), y todos los pesos y umbrales de la puntuación de disponibilidad son configurables mediante un fichero YAML para favorecer la reproducibilidad y el análisis de sensibilidad.</w:t>
       </w:r>
     </w:p>
     <w:p>
@@ -1713,40 +1723,68 @@
           <w:szCs w:val="24"/>
           <w:lang w:val="en-GB"/>
         </w:rPr>
-        <w:t>Maximum</w:t>
-      </w:r>
-      <w:r>
+        <w:t>Machine learning (ML) has become a core technology across high-impact domains such as healthcare, finance, and recommendation systems. However, the reliability of trained models depends critically on the quality of the data used during training. Two particularly damaging and often overlooked problems are dataset quality defects — missing values, duplicate rows, class imbalance, outliers, and near-constant features — and data leakage, which occurs when information that would not be available at prediction time is inadvertently used during training, artificially inflating evaluation metrics while masking poor real-world generalisation.</w:t>
+      </w:r>
+    </w:p>
+    <w:p>
+      <w:pPr/>
+      <w:r>
+        <w:t>This thesis presents ml-framework, an open-source, YAML-configurable system for automated dataset quality assessment and data leakage detection in machine learning workflows. The framework implements a sequential pipeline of up to 22 checks organised into six dimensions: data quality, leakage, feature analysis, statistical sufficiency, drift detection, and performance impact. The system is accessible through three interfaces — a command-line tool, a Python SDK (the DatasetChecker class), and an interactive Streamlit web application — and supports custom checks through a plugin system based on a @register_check decorator.</w:t>
+      </w:r>
+    </w:p>
+    <w:p>
+      <w:pPr/>
+      <w:r>
+        <w:t>The most significant methodological contribution is the unified leakage risk score, L(f) = 0.35·ρ(f) + 0.35·Ĩ(f;y) + 0.30·π(f), which combines Pearson correlation or Cramér's V, normalised mutual information, and per-feature performance inflation into a single interpretable metric. A complementary module based on GPT-4o-mini (via Azure OpenAI) extends this with semantic leakage detection, identifying features whose names or descriptions reveal temporal, indirect, or post-hoc information that purely statistical methods cannot capture, while degrading gracefully to a no-op when no API credentials are configured.</w:t>
+      </w:r>
+    </w:p>
+    <w:p>
+      <w:pPr/>
+      <w:r>
+        <w:t>The framework was evaluated on twelve datasets — six synthetic, generated under controlled conditions, and six real-world datasets from OpenML and the UCI repository (Titanic, Pima Diabetes, Adult Census Income, German Credit, Heart Disease, and Wine Quality) — achieving a 4/4 detection rate on deliberately constructed leakage scenarios and calibrated readiness scores ranging from 65 (grade C, dirty data) to 95 (grade A, clean control data). A quantitative benchmark against three established tools (Deepchecks, Great Expectations, and ydata-profiling) shows that ml-framework covers 29 of 29 evaluated checks, versus at most 11 of 29 for the best alternative, and detects 4 of 4 leakage scenarios versus 0–1 for the others. The semantic module, evaluated on a manually labelled 30-feature benchmark, achieves a precision of 1.00 and a recall of 0.93 (F1 = 0.96). Three additional real-world case studies (Titanic, Adult Census, and German Credit) are documented, and every weight, penalty, and threshold used by the readiness score is exposed through a configuration file to support reproducibility and sensitivity analysis.</w:t>
+      </w:r>
+    </w:p>
+    <w:p>
+      <w:pPr/>
+      <w:r>
+        <w:t>The framework is fully open-sourced at https://github.com/jaimecano12/ml-framework.</w:t>
+      </w:r>
+    </w:p>
+    <w:p>
+      <w:pPr>
         <w:rPr>
           <w:sz w:val="24"/>
           <w:szCs w:val="24"/>
           <w:lang w:val="en-GB"/>
         </w:rPr>
-        <w:t xml:space="preserve"> number of </w:t>
-      </w:r>
-      <w:r>
+      </w:pPr>
+    </w:p>
+    <w:p>
+      <w:pPr>
         <w:rPr>
           <w:sz w:val="24"/>
           <w:szCs w:val="24"/>
           <w:lang w:val="en-GB"/>
         </w:rPr>
-        <w:t>words:</w:t>
-      </w:r>
-      <w:r>
+      </w:pPr>
+    </w:p>
+    <w:p>
+      <w:pPr>
         <w:rPr>
           <w:sz w:val="24"/>
           <w:szCs w:val="24"/>
           <w:lang w:val="en-GB"/>
         </w:rPr>
-        <w:t xml:space="preserve"> 500</w:t>
-      </w:r>
-      <w:r>
+      </w:pPr>
+    </w:p>
+    <w:p>
+      <w:pPr>
         <w:rPr>
           <w:sz w:val="24"/>
           <w:szCs w:val="24"/>
           <w:lang w:val="en-GB"/>
         </w:rPr>
-        <w:t>…</w:t>
-      </w:r>
+      </w:pPr>
     </w:p>
     <w:p>
       <w:pPr>
@@ -1786,42 +1824,6 @@
     </w:p>
     <w:p>
       <w:pPr>
-        <w:rPr>
-          <w:sz w:val="24"/>
-          <w:szCs w:val="24"/>
-          <w:lang w:val="en-GB"/>
-        </w:rPr>
-      </w:pPr>
-    </w:p>
-    <w:p>
-      <w:pPr>
-        <w:rPr>
-          <w:sz w:val="24"/>
-          <w:szCs w:val="24"/>
-          <w:lang w:val="en-GB"/>
-        </w:rPr>
-      </w:pPr>
-    </w:p>
-    <w:p>
-      <w:pPr>
-        <w:rPr>
-          <w:sz w:val="24"/>
-          <w:szCs w:val="24"/>
-          <w:lang w:val="en-GB"/>
-        </w:rPr>
-      </w:pPr>
-    </w:p>
-    <w:p>
-      <w:pPr>
-        <w:rPr>
-          <w:sz w:val="24"/>
-          <w:szCs w:val="24"/>
-          <w:lang w:val="en-GB"/>
-        </w:rPr>
-      </w:pPr>
-    </w:p>
-    <w:p>
-      <w:pPr>
         <w:pStyle w:val="Ttulo"/>
         <w:rPr>
           <w:lang w:val="es-ES"/>
@@ -1848,118 +1850,38 @@
           <w:szCs w:val="24"/>
           <w:lang w:val="es-ES"/>
         </w:rPr>
-        <w:t xml:space="preserve">Deben </w:t>
-      </w:r>
-      <w:r>
-        <w:rPr>
-          <w:sz w:val="24"/>
-          <w:szCs w:val="24"/>
+        <w:t>calidad de datos; fuga de datos (data leakage); aprendizaje automático centrado en datos; puntuación de disponibilidad de un dataset; información mutua; modelos de lenguaje (LLM); GPT-4o-mini; configuración YAML.</w:t>
+      </w:r>
+    </w:p>
+    <w:p>
+      <w:pPr>
+        <w:pStyle w:val="Ttulo"/>
+        <w:rPr>
           <w:lang w:val="es-ES"/>
         </w:rPr>
-        <w:t>reflej</w:t>
-      </w:r>
-      <w:r>
-        <w:rPr>
-          <w:sz w:val="24"/>
-          <w:szCs w:val="24"/>
+      </w:pPr>
+      <w:r>
+        <w:rPr>
           <w:lang w:val="es-ES"/>
         </w:rPr>
-        <w:t>ar</w:t>
-      </w:r>
-      <w:r>
+        <w:t>KEYWORDS</w:t>
+      </w:r>
+    </w:p>
+    <w:p>
+      <w:pPr>
         <w:rPr>
           <w:sz w:val="24"/>
           <w:szCs w:val="24"/>
           <w:lang w:val="es-ES"/>
         </w:rPr>
-        <w:t xml:space="preserve"> el contenido del trabajo</w:t>
-      </w:r>
+      </w:pPr>
       <w:r>
         <w:rPr>
           <w:sz w:val="24"/>
           <w:szCs w:val="24"/>
           <w:lang w:val="es-ES"/>
         </w:rPr>
-        <w:t xml:space="preserve">, </w:t>
-      </w:r>
-      <w:r>
-        <w:rPr>
-          <w:sz w:val="24"/>
-          <w:szCs w:val="24"/>
-          <w:lang w:val="es-ES"/>
-        </w:rPr>
-        <w:t xml:space="preserve">deberían </w:t>
-      </w:r>
-      <w:r>
-        <w:rPr>
-          <w:sz w:val="24"/>
-          <w:szCs w:val="24"/>
-          <w:lang w:val="es-ES"/>
-        </w:rPr>
-        <w:t>servir para</w:t>
-      </w:r>
-      <w:r>
-        <w:rPr>
-          <w:sz w:val="24"/>
-          <w:szCs w:val="24"/>
-          <w:lang w:val="es-ES"/>
-        </w:rPr>
-        <w:t xml:space="preserve"> localizar el TFM</w:t>
-      </w:r>
-      <w:r>
-        <w:rPr>
-          <w:sz w:val="24"/>
-          <w:szCs w:val="24"/>
-          <w:lang w:val="es-ES"/>
-        </w:rPr>
-        <w:t xml:space="preserve"> mediante búsqueda bibliográfica.</w:t>
-      </w:r>
-      <w:r>
-        <w:rPr>
-          <w:sz w:val="24"/>
-          <w:szCs w:val="24"/>
-          <w:lang w:val="es-ES"/>
-        </w:rPr>
-        <w:t>.</w:t>
-      </w:r>
-      <w:r>
-        <w:rPr>
-          <w:sz w:val="24"/>
-          <w:szCs w:val="24"/>
-          <w:lang w:val="es-ES"/>
-        </w:rPr>
-        <w:t>.</w:t>
-      </w:r>
-    </w:p>
-    <w:p>
-      <w:pPr>
-        <w:pStyle w:val="Ttulo"/>
-        <w:rPr>
-          <w:lang w:val="es-ES"/>
-        </w:rPr>
-      </w:pPr>
-      <w:r>
-        <w:rPr>
-          <w:lang w:val="es-ES"/>
-        </w:rPr>
-        <w:t>KEYWORDS</w:t>
-      </w:r>
-    </w:p>
-    <w:p>
-      <w:pPr>
-        <w:rPr>
-          <w:sz w:val="24"/>
-          <w:szCs w:val="24"/>
-          <w:lang w:val="es-ES"/>
-        </w:rPr>
-      </w:pPr>
-      <w:r>
-        <w:rPr>
-          <w:sz w:val="24"/>
-          <w:szCs w:val="24"/>
-          <w:lang w:val="es-ES"/>
-        </w:rPr>
-        <w:t>….</w:t>
+        <w:t>data quality; data leakage; data-centric AI; dataset readiness score; mutual information; large language models (LLM); GPT-4o-mini; YAML configuration.</w:t>
       </w:r>
     </w:p>
     <w:p>
@@ -9338,6 +9260,178 @@
     </w:p>
     <w:p>
       <w:pPr>
+        <w:pStyle w:val="Ttulo3"/>
+      </w:pPr>
+      <w:r>
+        <w:t>Phase 7 – Experiment Scripts and End-to-End Pipeline</w:t>
+      </w:r>
+    </w:p>
+    <w:p>
+      <w:pPr/>
+      <w:r>
+        <w:t>Phase 7 introduced the experimental infrastructure required to validate the framework end-to-end. The script scripts/generate_data.py programmatically creates six synthetic datasets with controlled characteristics: a clean control dataset, a dataset with multiple quality defects, a dataset with injected target leakage, and three additional datasets used in later phases to exercise graded proxy leakage, temporal leakage, and combined multi-type leakage scenarios (proxy_leakage.csv, temporal_leakage_ext.csv, multitype_leakage.csv). The companion script scripts/run_pipeline.py executes the complete pipeline against any configured dataset and prints a human-readable summary, serving both as a smoke test and as a usage demonstration. Together, these scripts make every experiment reported in Chapter 3 fully reproducible from a single command.</w:t>
+      </w:r>
+    </w:p>
+    <w:p>
+      <w:pPr>
+        <w:pStyle w:val="Ttulo3"/>
+      </w:pPr>
+      <w:r>
+        <w:t>Phase 8 – Recommendations Module</w:t>
+      </w:r>
+    </w:p>
+    <w:p>
+      <w:pPr/>
+      <w:r>
+        <w:t>The recommendations module (src/recommendations.py) translates the raw output of the analysis pipeline into actionable guidance. For each failed CheckResult produced by the quality, leakage, feature, and sufficiency modules, a dedicated handler function generates a Recommendation dataclass containing the affected check name, a priority level (high, medium, or low), a short natural-language action, a rationale explaining why the action matters, and, where applicable, a ready-to-use Python code snippet — for example, a df.drop_duplicates() call for duplicate rows, or a stratified split for class imbalance. Twenty handler functions cover all checks implemented at the time of writing. Recommendations are sorted by priority and exposed through the FrameworkReport, the HTML report, and the checker.top_recommendations() SDK method, allowing practitioners to move directly from diagnosis to remediation.</w:t>
+      </w:r>
+    </w:p>
+    <w:p>
+      <w:pPr>
+        <w:pStyle w:val="Ttulo3"/>
+      </w:pPr>
+      <w:r>
+        <w:t>Phase 9 – Feature Analysis Module</w:t>
+      </w:r>
+    </w:p>
+    <w:p>
+      <w:pPr/>
+      <w:r>
+        <w:t>The feature analysis module (src/feature_analysis.py) implements three complementary checks oriented towards understanding the relationship between input features and the prediction target. The correlation check builds a pairwise correlation matrix and flags feature pairs above a configurable threshold as redundant. The mutual information relevance check ranks every feature by its normalised mutual information with the target, highlighting both highly informative and effectively useless features. The distribution check computes skewness and kurtosis for numeric columns and flags strongly skewed distributions that may benefit from a transformation before training. The normalised mutual information computed in this module is reused directly by the unified leakage risk score introduced in Phase 16.</w:t>
+      </w:r>
+    </w:p>
+    <w:p>
+      <w:pPr>
+        <w:pStyle w:val="Ttulo3"/>
+      </w:pPr>
+      <w:r>
+        <w:t>Phase 10 – Dataset Readiness Score</w:t>
+      </w:r>
+    </w:p>
+    <w:p>
+      <w:pPr/>
+      <w:r>
+        <w:t>Phase 10 introduced the Dataset Readiness Score, a single 0–100 metric that summarises the outcome of the entire pipeline. The score (src/scoring.py) is computed as a weighted combination of four dimension scores — quality, leakage, feature analysis, and statistical sufficiency — where each dimension score starts at 100 and is penalised by a fixed amount for every failed check (15 points for an error, 5 points for a warning), with leakage failures additionally scaled by a 1.5× multiplier to reflect their disproportionate impact on model reliability. The composite score is mapped onto a letter grade from A (score ≥ 85, dataset ready for training) to F (score &lt; 40, dataset unsuitable). The readiness score and grade are surfaced in the CLI summary, the HTML report header, and the DatasetChecker.score / .grade SDK properties.</w:t>
+      </w:r>
+    </w:p>
+    <w:p>
+      <w:pPr>
+        <w:pStyle w:val="Ttulo3"/>
+      </w:pPr>
+      <w:r>
+        <w:t>Phase 11 – Statistical Sufficiency Module</w:t>
+      </w:r>
+    </w:p>
+    <w:p>
+      <w:pPr/>
+      <w:r>
+        <w:t>The sufficiency module (src/sufficiency.py) implements four statistical checks that assess whether a dataset contains enough observations to support reliable model training and evaluation. These include the sample-to-feature ratio (n/p), a minimum-class-size check for classification targets, an estimate of the effective training-set size after the configured train/test split, and a learning-curve-based check that fits the configured model on increasing fractions of the data and flags datasets where performance has clearly not yet plateaued. Together, these checks address a dimension of dataset quality that is independent of the values themselves: even a dataset entirely free of quality and leakage issues may still be too small to support a trustworthy model.</w:t>
+      </w:r>
+    </w:p>
+    <w:p>
+      <w:pPr>
+        <w:pStyle w:val="Ttulo3"/>
+      </w:pPr>
+      <w:r>
+        <w:t>Phase 12 – Streamlit Web Application</w:t>
+      </w:r>
+    </w:p>
+    <w:p>
+      <w:pPr/>
+      <w:r>
+        <w:t>To make the framework accessible to non-technical stakeholders, Phase 12 added an interactive web application (app/app.py) built with Streamlit. The application allows a user to upload a CSV file, configure the target column and key thresholds through sidebar widgets, and trigger the full analysis pipeline with a single click. Results are displayed as interactive tables and charts directly in the browser, and the generated HTML report can be downloaded for offline use. The Streamlit interface reuses the same DatasetChecker SDK introduced in Phase 13, ensuring that the command-line, programmatic, and web interfaces always remain functionally consistent.</w:t>
+      </w:r>
+    </w:p>
+    <w:p>
+      <w:pPr>
+        <w:pStyle w:val="Ttulo3"/>
+      </w:pPr>
+      <w:r>
+        <w:t>Phase 13 – Python SDK</w:t>
+      </w:r>
+    </w:p>
+    <w:p>
+      <w:pPr/>
+      <w:r>
+        <w:t>Phase 13 introduced DatasetChecker (src/checker.py), a high-level object-oriented interface designed for use inside notebooks and larger Python applications. A DatasetChecker instance is constructed from an optional YAML configuration file, exposes a fluent .set() method for overriding individual configuration values via dot-notation keyword arguments, and runs the full pipeline through a single .run(dataset, target_col) call. After execution, convenience properties such as .score, .grade, .failed_checks(), .top_recommendations(), and .summary() provide direct programmatic access to the results, while .save_report() and .to_dict() support exporting the findings as an HTML report or a JSON-serialisable dictionary, respectively.</w:t>
+      </w:r>
+    </w:p>
+    <w:p>
+      <w:pPr>
+        <w:pStyle w:val="Ttulo3"/>
+      </w:pPr>
+      <w:r>
+        <w:t>Phase 14 – Drift Detection Module</w:t>
+      </w:r>
+    </w:p>
+    <w:p>
+      <w:pPr/>
+      <w:r>
+        <w:t>The drift detection module (src/drift_checks.py) addresses a complementary problem to the one-off validation performed by the rest of the pipeline: monitoring whether a dataset's statistical properties change over time relative to a reference distribution. Two checks are implemented. The covariate drift check applies the two-sample Kolmogorov–Smirnov test to each numeric feature, comparing a reference and a current sample and flagging features whose distributions differ significantly. The label drift check computes the Population Stability Index (PSI) between the reference and current distributions of the target variable, flagging shifts above configurable warning and critical thresholds. Both checks are designed to be run periodically against incoming production data, extending the framework's relevance beyond the initial pre-training validation stage.</w:t>
+      </w:r>
+    </w:p>
+    <w:p>
+      <w:pPr>
+        <w:pStyle w:val="Ttulo3"/>
+      </w:pPr>
+      <w:r>
+        <w:t>Phase 15 – Plugin System</w:t>
+      </w:r>
+    </w:p>
+    <w:p>
+      <w:pPr/>
+      <w:r>
+        <w:t>Phase 15 introduced an extensibility mechanism (src/plugins.py) based on a @register_check decorator. Any Python function decorated with @register_check and matching the standard CheckResult-returning signature used throughout the framework is automatically registered in a global plugin registry. Plugin modules listed under the plugins key of the YAML configuration are dynamically imported at run time via load_plugins(), and their checks are executed alongside the built-in pipeline, with their results merged into the same FrameworkReport. This design allows organisations to add domain-specific or proprietary checks — for example, business-rule validations — without modifying the framework's source code.</w:t>
+      </w:r>
+    </w:p>
+    <w:p>
+      <w:pPr>
+        <w:pStyle w:val="Ttulo3"/>
+      </w:pPr>
+      <w:r>
+        <w:t>Phase 16 – Unified Leakage Risk Score and Semantic Analysis</w:t>
+      </w:r>
+    </w:p>
+    <w:p>
+      <w:pPr/>
+      <w:r>
+        <w:t>Phase 16 was motivated directly by feedback received during the first supervision review and represents the framework's most significant methodological contribution. The four leakage checks introduced in Phase 4 were complemented with a fifth check, leakage_risk_score, which combines three independent signals into a single per-feature score:</w:t>
+      </w:r>
+    </w:p>
+    <w:p>
+      <w:pPr/>
+      <w:r>
+        <w:t>L(f) = 0.35·ρ(f) + 0.35·Ĩ(f;y) + 0.30·π(f)</w:t>
+      </w:r>
+    </w:p>
+    <w:p>
+      <w:pPr/>
+      <w:r>
+        <w:t>where ρ(f) is the absolute Pearson correlation (or Cramér's V for categorical features) between feature f and the target y, Ĩ(f;y) is the mutual information between f and y normalised by the maximum mutual information observed across all features, and π(f) is the relative accuracy inflation obtained when a model is trained with f included versus excluded. Features with L(f) ≥ 0.7 are flagged as a warning and those with L(f) ≥ 0.9 as an error.</w:t>
+      </w:r>
+    </w:p>
+    <w:p>
+      <w:pPr/>
+      <w:r>
+        <w:t>To validate features whose risk is semantic rather than statistical — for instance, a column literally named days_until_readmission — a complementary module (src/semantic_leakage.py) sends feature names, sample values, and a short dataset description to GPT-4o-mini via Azure OpenAI, which returns a structured risk_level (none/low/medium/high) and a leakage_type (temporal, proxy, post-hoc, or indirect) for each feature. The module degrades gracefully to a no-op when Azure OpenAI credentials are not configured, so that the rest of the pipeline remains fully functional offline.</w:t>
+      </w:r>
+    </w:p>
+    <w:p>
+      <w:pPr>
+        <w:pStyle w:val="Ttulo3"/>
+      </w:pPr>
+      <w:r>
+        <w:t>Phase 17 – LLM Benchmark, Configurable Scoring, and Real-World Case Studies</w:t>
+      </w:r>
+    </w:p>
+    <w:p>
+      <w:pPr/>
+      <w:r>
+        <w:t>The final development phase responded to a second round of supervisor feedback and consisted of five complementary additions. First, a 30-feature semantic leakage benchmark (data/semantic_benchmark.json), spanning five domains (hospital readmission, loan default, customer churn, manufacturing defects, and employee promotion) with manually assigned ground-truth risk levels and leakage types, together with an evaluation script (scripts/evaluate_semantic_leakage.py) that reports precision, recall, and F1 for the semantic module. Second, every parameter of the readiness score — dimension weights, severity penalties, the leakage multiplier, and grade thresholds — was externalised into a scoring block of configs/config.yaml and is now read by compute_readiness_score() through a _resolve_config() helper that falls back to the original defaults when a parameter is not specified, preserving full backward compatibility. Third, scripts/case_studies.py runs the complete pipeline on three real-world datasets (Titanic, Adult Census Income, and German Credit) and extracts the highest-priority findings and recommendations for each, saving the results to reports/case_studies.json. Fourth and fifth, the readiness-score weighting rationale and a discussion of the scope and fairness of the quantitative benchmark were added to the accompanying research paper. The detailed results of all five additions are presented in Chapter 3.</w:t>
+      </w:r>
+    </w:p>
+    <w:p>
+      <w:pPr>
         <w:pStyle w:val="Ttulo2"/>
       </w:pPr>
       <w:r>
@@ -10775,7 +10869,7 @@
       </w:pPr>
       <w:bookmarkStart w:id="12" w:name="_Toc227832076"/>
       <w:r>
-        <w:t>resultados</w:t>
+        <w:t>Results</w:t>
       </w:r>
       <w:bookmarkEnd w:id="12"/>
     </w:p>
@@ -10789,7 +10883,3803 @@
         <w:rPr>
           <w:lang w:val="en-GB"/>
         </w:rPr>
-        <w:t>….</w:t>
+        <w:t>This chapter presents the complete experimental evaluation of ml-framework, extending the preliminary results of Chapter 2 (which cover Phases 1–6) with the additional datasets, validation experiments, and comparative benchmarks introduced in Phases 7–17. All results reported below are reproducible by running the scripts referenced in Chapter 2 (scripts/generate_data.py, scripts/download_real_datasets.py, scripts/download_more_datasets.py, scripts/benchmark_comparison.py, scripts/evaluate_semantic_leakage.py, and scripts/case_studies.py).</w:t>
+      </w:r>
+    </w:p>
+    <w:p>
+      <w:pPr>
+        <w:pStyle w:val="Ttulo2"/>
+      </w:pPr>
+      <w:r>
+        <w:t>3.1 Extended Dataset Suite</w:t>
+      </w:r>
+    </w:p>
+    <w:p>
+      <w:pPr/>
+      <w:r>
+        <w:t>The framework was evaluated on a suite of twelve datasets: six synthetic datasets generated under controlled conditions to isolate specific quality and leakage scenarios, and six real-world datasets obtained from OpenML and the UCI Machine Learning Repository. Table 3.1 summarises the full suite.</w:t>
+      </w:r>
+    </w:p>
+    <w:tbl>
+      <w:tblPr>
+        <w:tblStyle w:val="Tablaconcuadrcula4-nfasis1"/>
+        <w:tblW w:type="auto" w:w="0"/>
+        <w:tblLook w:val="04A0" w:firstRow="1" w:lastRow="0" w:firstColumn="1" w:lastColumn="0" w:noHBand="0" w:noVBand="1"/>
+      </w:tblPr>
+      <w:tblGrid>
+        <w:gridCol w:w="3489"/>
+        <w:gridCol w:w="3489"/>
+        <w:gridCol w:w="3489"/>
+        <w:gridCol w:w="3489"/>
+      </w:tblGrid>
+      <w:tr>
+        <w:tc>
+          <w:tcPr>
+            <w:tcW w:type="dxa" w:w="3489"/>
+          </w:tcPr>
+          <w:p>
+            <w:pPr>
+              <w:jc w:val="center"/>
+            </w:pPr>
+            <w:r/>
+            <w:r>
+              <w:t>Dataset</w:t>
+            </w:r>
+          </w:p>
+        </w:tc>
+        <w:tc>
+          <w:tcPr>
+            <w:tcW w:type="dxa" w:w="3489"/>
+          </w:tcPr>
+          <w:p>
+            <w:pPr>
+              <w:jc w:val="center"/>
+            </w:pPr>
+            <w:r/>
+            <w:r>
+              <w:t>Type</w:t>
+            </w:r>
+          </w:p>
+        </w:tc>
+        <w:tc>
+          <w:tcPr>
+            <w:tcW w:type="dxa" w:w="3489"/>
+          </w:tcPr>
+          <w:p>
+            <w:pPr>
+              <w:jc w:val="center"/>
+            </w:pPr>
+            <w:r/>
+            <w:r>
+              <w:t>Rows</w:t>
+            </w:r>
+          </w:p>
+        </w:tc>
+        <w:tc>
+          <w:tcPr>
+            <w:tcW w:type="dxa" w:w="3489"/>
+          </w:tcPr>
+          <w:p>
+            <w:pPr>
+              <w:jc w:val="center"/>
+            </w:pPr>
+            <w:r/>
+            <w:r>
+              <w:t>Description</w:t>
+            </w:r>
+          </w:p>
+        </w:tc>
+      </w:tr>
+      <w:tr>
+        <w:tc>
+          <w:tcPr>
+            <w:tcW w:type="dxa" w:w="3489"/>
+          </w:tcPr>
+          <w:p>
+            <w:pPr>
+              <w:jc w:val="center"/>
+            </w:pPr>
+            <w:r/>
+            <w:r>
+              <w:t>clean_dataset.csv</w:t>
+            </w:r>
+          </w:p>
+        </w:tc>
+        <w:tc>
+          <w:tcPr>
+            <w:tcW w:type="dxa" w:w="3489"/>
+          </w:tcPr>
+          <w:p>
+            <w:pPr>
+              <w:jc w:val="center"/>
+            </w:pPr>
+            <w:r/>
+            <w:r>
+              <w:t>Synthetic</w:t>
+            </w:r>
+          </w:p>
+        </w:tc>
+        <w:tc>
+          <w:tcPr>
+            <w:tcW w:type="dxa" w:w="3489"/>
+          </w:tcPr>
+          <w:p>
+            <w:pPr>
+              <w:jc w:val="center"/>
+            </w:pPr>
+            <w:r/>
+            <w:r>
+              <w:t>500</w:t>
+            </w:r>
+          </w:p>
+        </w:tc>
+        <w:tc>
+          <w:tcPr>
+            <w:tcW w:type="dxa" w:w="3489"/>
+          </w:tcPr>
+          <w:p>
+            <w:pPr>
+              <w:jc w:val="center"/>
+            </w:pPr>
+            <w:r/>
+            <w:r>
+              <w:t>Control dataset with no quality or leakage issues</w:t>
+            </w:r>
+          </w:p>
+        </w:tc>
+      </w:tr>
+      <w:tr>
+        <w:tc>
+          <w:tcPr>
+            <w:tcW w:type="dxa" w:w="3489"/>
+          </w:tcPr>
+          <w:p>
+            <w:pPr>
+              <w:jc w:val="center"/>
+            </w:pPr>
+            <w:r/>
+            <w:r>
+              <w:t>dirty_dataset.csv</w:t>
+            </w:r>
+          </w:p>
+        </w:tc>
+        <w:tc>
+          <w:tcPr>
+            <w:tcW w:type="dxa" w:w="3489"/>
+          </w:tcPr>
+          <w:p>
+            <w:pPr>
+              <w:jc w:val="center"/>
+            </w:pPr>
+            <w:r/>
+            <w:r>
+              <w:t>Synthetic</w:t>
+            </w:r>
+          </w:p>
+        </w:tc>
+        <w:tc>
+          <w:tcPr>
+            <w:tcW w:type="dxa" w:w="3489"/>
+          </w:tcPr>
+          <w:p>
+            <w:pPr>
+              <w:jc w:val="center"/>
+            </w:pPr>
+            <w:r/>
+            <w:r>
+              <w:t>5,300</w:t>
+            </w:r>
+          </w:p>
+        </w:tc>
+        <w:tc>
+          <w:tcPr>
+            <w:tcW w:type="dxa" w:w="3489"/>
+          </w:tcPr>
+          <w:p>
+            <w:pPr>
+              <w:jc w:val="center"/>
+            </w:pPr>
+            <w:r/>
+            <w:r>
+              <w:t>Multiple quality defects (missing values, duplicates, outliers, imbalance)</w:t>
+            </w:r>
+          </w:p>
+        </w:tc>
+      </w:tr>
+      <w:tr>
+        <w:tc>
+          <w:tcPr>
+            <w:tcW w:type="dxa" w:w="3489"/>
+          </w:tcPr>
+          <w:p>
+            <w:pPr>
+              <w:jc w:val="center"/>
+            </w:pPr>
+            <w:r/>
+            <w:r>
+              <w:t>leaky_dataset.csv</w:t>
+            </w:r>
+          </w:p>
+        </w:tc>
+        <w:tc>
+          <w:tcPr>
+            <w:tcW w:type="dxa" w:w="3489"/>
+          </w:tcPr>
+          <w:p>
+            <w:pPr>
+              <w:jc w:val="center"/>
+            </w:pPr>
+            <w:r/>
+            <w:r>
+              <w:t>Synthetic</w:t>
+            </w:r>
+          </w:p>
+        </w:tc>
+        <w:tc>
+          <w:tcPr>
+            <w:tcW w:type="dxa" w:w="3489"/>
+          </w:tcPr>
+          <w:p>
+            <w:pPr>
+              <w:jc w:val="center"/>
+            </w:pPr>
+            <w:r/>
+            <w:r>
+              <w:t>5,320</w:t>
+            </w:r>
+          </w:p>
+        </w:tc>
+        <w:tc>
+          <w:tcPr>
+            <w:tcW w:type="dxa" w:w="3489"/>
+          </w:tcPr>
+          <w:p>
+            <w:pPr>
+              <w:jc w:val="center"/>
+            </w:pPr>
+            <w:r/>
+            <w:r>
+              <w:t>Target, temporal, and ID-column leakage</w:t>
+            </w:r>
+          </w:p>
+        </w:tc>
+      </w:tr>
+      <w:tr>
+        <w:tc>
+          <w:tcPr>
+            <w:tcW w:type="dxa" w:w="3489"/>
+          </w:tcPr>
+          <w:p>
+            <w:pPr>
+              <w:jc w:val="center"/>
+            </w:pPr>
+            <w:r/>
+            <w:r>
+              <w:t>proxy_leakage.csv</w:t>
+            </w:r>
+          </w:p>
+        </w:tc>
+        <w:tc>
+          <w:tcPr>
+            <w:tcW w:type="dxa" w:w="3489"/>
+          </w:tcPr>
+          <w:p>
+            <w:pPr>
+              <w:jc w:val="center"/>
+            </w:pPr>
+            <w:r/>
+            <w:r>
+              <w:t>Synthetic</w:t>
+            </w:r>
+          </w:p>
+        </w:tc>
+        <w:tc>
+          <w:tcPr>
+            <w:tcW w:type="dxa" w:w="3489"/>
+          </w:tcPr>
+          <w:p>
+            <w:pPr>
+              <w:jc w:val="center"/>
+            </w:pPr>
+            <w:r/>
+            <w:r>
+              <w:t>1,000</w:t>
+            </w:r>
+          </w:p>
+        </w:tc>
+        <w:tc>
+          <w:tcPr>
+            <w:tcW w:type="dxa" w:w="3489"/>
+          </w:tcPr>
+          <w:p>
+            <w:pPr>
+              <w:jc w:val="center"/>
+            </w:pPr>
+            <w:r/>
+            <w:r>
+              <w:t>Graded noisy proxy features for the target</w:t>
+            </w:r>
+          </w:p>
+        </w:tc>
+      </w:tr>
+      <w:tr>
+        <w:tc>
+          <w:tcPr>
+            <w:tcW w:type="dxa" w:w="3489"/>
+          </w:tcPr>
+          <w:p>
+            <w:pPr>
+              <w:jc w:val="center"/>
+            </w:pPr>
+            <w:r/>
+            <w:r>
+              <w:t>temporal_leakage_ext.csv</w:t>
+            </w:r>
+          </w:p>
+        </w:tc>
+        <w:tc>
+          <w:tcPr>
+            <w:tcW w:type="dxa" w:w="3489"/>
+          </w:tcPr>
+          <w:p>
+            <w:pPr>
+              <w:jc w:val="center"/>
+            </w:pPr>
+            <w:r/>
+            <w:r>
+              <w:t>Synthetic</w:t>
+            </w:r>
+          </w:p>
+        </w:tc>
+        <w:tc>
+          <w:tcPr>
+            <w:tcW w:type="dxa" w:w="3489"/>
+          </w:tcPr>
+          <w:p>
+            <w:pPr>
+              <w:jc w:val="center"/>
+            </w:pPr>
+            <w:r/>
+            <w:r>
+              <w:t>2,000</w:t>
+            </w:r>
+          </w:p>
+        </w:tc>
+        <w:tc>
+          <w:tcPr>
+            <w:tcW w:type="dxa" w:w="3489"/>
+          </w:tcPr>
+          <w:p>
+            <w:pPr>
+              <w:jc w:val="center"/>
+            </w:pPr>
+            <w:r/>
+            <w:r>
+              <w:t>Customer churn with a future-usage feature</w:t>
+            </w:r>
+          </w:p>
+        </w:tc>
+      </w:tr>
+      <w:tr>
+        <w:tc>
+          <w:tcPr>
+            <w:tcW w:type="dxa" w:w="3489"/>
+          </w:tcPr>
+          <w:p>
+            <w:pPr>
+              <w:jc w:val="center"/>
+            </w:pPr>
+            <w:r/>
+            <w:r>
+              <w:t>multitype_leakage.csv</w:t>
+            </w:r>
+          </w:p>
+        </w:tc>
+        <w:tc>
+          <w:tcPr>
+            <w:tcW w:type="dxa" w:w="3489"/>
+          </w:tcPr>
+          <w:p>
+            <w:pPr>
+              <w:jc w:val="center"/>
+            </w:pPr>
+            <w:r/>
+            <w:r>
+              <w:t>Synthetic</w:t>
+            </w:r>
+          </w:p>
+        </w:tc>
+        <w:tc>
+          <w:tcPr>
+            <w:tcW w:type="dxa" w:w="3489"/>
+          </w:tcPr>
+          <w:p>
+            <w:pPr>
+              <w:jc w:val="center"/>
+            </w:pPr>
+            <w:r/>
+            <w:r>
+              <w:t>1,500</w:t>
+            </w:r>
+          </w:p>
+        </w:tc>
+        <w:tc>
+          <w:tcPr>
+            <w:tcW w:type="dxa" w:w="3489"/>
+          </w:tcPr>
+          <w:p>
+            <w:pPr>
+              <w:jc w:val="center"/>
+            </w:pPr>
+            <w:r/>
+            <w:r>
+              <w:t>ICU mortality with proxy + temporal + ID leakage</w:t>
+            </w:r>
+          </w:p>
+        </w:tc>
+      </w:tr>
+      <w:tr>
+        <w:tc>
+          <w:tcPr>
+            <w:tcW w:type="dxa" w:w="3489"/>
+          </w:tcPr>
+          <w:p>
+            <w:pPr>
+              <w:jc w:val="center"/>
+            </w:pPr>
+            <w:r/>
+            <w:r>
+              <w:t>titanic.csv</w:t>
+            </w:r>
+          </w:p>
+        </w:tc>
+        <w:tc>
+          <w:tcPr>
+            <w:tcW w:type="dxa" w:w="3489"/>
+          </w:tcPr>
+          <w:p>
+            <w:pPr>
+              <w:jc w:val="center"/>
+            </w:pPr>
+            <w:r/>
+            <w:r>
+              <w:t>Real-world (OpenML)</w:t>
+            </w:r>
+          </w:p>
+        </w:tc>
+        <w:tc>
+          <w:tcPr>
+            <w:tcW w:type="dxa" w:w="3489"/>
+          </w:tcPr>
+          <w:p>
+            <w:pPr>
+              <w:jc w:val="center"/>
+            </w:pPr>
+            <w:r/>
+            <w:r>
+              <w:t>1,309</w:t>
+            </w:r>
+          </w:p>
+        </w:tc>
+        <w:tc>
+          <w:tcPr>
+            <w:tcW w:type="dxa" w:w="3489"/>
+          </w:tcPr>
+          <w:p>
+            <w:pPr>
+              <w:jc w:val="center"/>
+            </w:pPr>
+            <w:r/>
+            <w:r>
+              <w:t>Titanic survival prediction</w:t>
+            </w:r>
+          </w:p>
+        </w:tc>
+      </w:tr>
+      <w:tr>
+        <w:tc>
+          <w:tcPr>
+            <w:tcW w:type="dxa" w:w="3489"/>
+          </w:tcPr>
+          <w:p>
+            <w:pPr>
+              <w:jc w:val="center"/>
+            </w:pPr>
+            <w:r/>
+            <w:r>
+              <w:t>diabetes.csv</w:t>
+            </w:r>
+          </w:p>
+        </w:tc>
+        <w:tc>
+          <w:tcPr>
+            <w:tcW w:type="dxa" w:w="3489"/>
+          </w:tcPr>
+          <w:p>
+            <w:pPr>
+              <w:jc w:val="center"/>
+            </w:pPr>
+            <w:r/>
+            <w:r>
+              <w:t>Real-world (OpenML)</w:t>
+            </w:r>
+          </w:p>
+        </w:tc>
+        <w:tc>
+          <w:tcPr>
+            <w:tcW w:type="dxa" w:w="3489"/>
+          </w:tcPr>
+          <w:p>
+            <w:pPr>
+              <w:jc w:val="center"/>
+            </w:pPr>
+            <w:r/>
+            <w:r>
+              <w:t>768</w:t>
+            </w:r>
+          </w:p>
+        </w:tc>
+        <w:tc>
+          <w:tcPr>
+            <w:tcW w:type="dxa" w:w="3489"/>
+          </w:tcPr>
+          <w:p>
+            <w:pPr>
+              <w:jc w:val="center"/>
+            </w:pPr>
+            <w:r/>
+            <w:r>
+              <w:t>Pima Indians Diabetes</w:t>
+            </w:r>
+          </w:p>
+        </w:tc>
+      </w:tr>
+      <w:tr>
+        <w:tc>
+          <w:tcPr>
+            <w:tcW w:type="dxa" w:w="3489"/>
+          </w:tcPr>
+          <w:p>
+            <w:pPr>
+              <w:jc w:val="center"/>
+            </w:pPr>
+            <w:r/>
+            <w:r>
+              <w:t>adult.csv</w:t>
+            </w:r>
+          </w:p>
+        </w:tc>
+        <w:tc>
+          <w:tcPr>
+            <w:tcW w:type="dxa" w:w="3489"/>
+          </w:tcPr>
+          <w:p>
+            <w:pPr>
+              <w:jc w:val="center"/>
+            </w:pPr>
+            <w:r/>
+            <w:r>
+              <w:t>Real-world (UCI)</w:t>
+            </w:r>
+          </w:p>
+        </w:tc>
+        <w:tc>
+          <w:tcPr>
+            <w:tcW w:type="dxa" w:w="3489"/>
+          </w:tcPr>
+          <w:p>
+            <w:pPr>
+              <w:jc w:val="center"/>
+            </w:pPr>
+            <w:r/>
+            <w:r>
+              <w:t>48,842</w:t>
+            </w:r>
+          </w:p>
+        </w:tc>
+        <w:tc>
+          <w:tcPr>
+            <w:tcW w:type="dxa" w:w="3489"/>
+          </w:tcPr>
+          <w:p>
+            <w:pPr>
+              <w:jc w:val="center"/>
+            </w:pPr>
+            <w:r/>
+            <w:r>
+              <w:t>Adult Census Income</w:t>
+            </w:r>
+          </w:p>
+        </w:tc>
+      </w:tr>
+      <w:tr>
+        <w:tc>
+          <w:tcPr>
+            <w:tcW w:type="dxa" w:w="3489"/>
+          </w:tcPr>
+          <w:p>
+            <w:pPr>
+              <w:jc w:val="center"/>
+            </w:pPr>
+            <w:r/>
+            <w:r>
+              <w:t>german_credit.csv</w:t>
+            </w:r>
+          </w:p>
+        </w:tc>
+        <w:tc>
+          <w:tcPr>
+            <w:tcW w:type="dxa" w:w="3489"/>
+          </w:tcPr>
+          <w:p>
+            <w:pPr>
+              <w:jc w:val="center"/>
+            </w:pPr>
+            <w:r/>
+            <w:r>
+              <w:t>Real-world (UCI)</w:t>
+            </w:r>
+          </w:p>
+        </w:tc>
+        <w:tc>
+          <w:tcPr>
+            <w:tcW w:type="dxa" w:w="3489"/>
+          </w:tcPr>
+          <w:p>
+            <w:pPr>
+              <w:jc w:val="center"/>
+            </w:pPr>
+            <w:r/>
+            <w:r>
+              <w:t>1,000</w:t>
+            </w:r>
+          </w:p>
+        </w:tc>
+        <w:tc>
+          <w:tcPr>
+            <w:tcW w:type="dxa" w:w="3489"/>
+          </w:tcPr>
+          <w:p>
+            <w:pPr>
+              <w:jc w:val="center"/>
+            </w:pPr>
+            <w:r/>
+            <w:r>
+              <w:t>German Credit risk classification</w:t>
+            </w:r>
+          </w:p>
+        </w:tc>
+      </w:tr>
+      <w:tr>
+        <w:tc>
+          <w:tcPr>
+            <w:tcW w:type="dxa" w:w="3489"/>
+          </w:tcPr>
+          <w:p>
+            <w:pPr>
+              <w:jc w:val="center"/>
+            </w:pPr>
+            <w:r/>
+            <w:r>
+              <w:t>heart_disease.csv</w:t>
+            </w:r>
+          </w:p>
+        </w:tc>
+        <w:tc>
+          <w:tcPr>
+            <w:tcW w:type="dxa" w:w="3489"/>
+          </w:tcPr>
+          <w:p>
+            <w:pPr>
+              <w:jc w:val="center"/>
+            </w:pPr>
+            <w:r/>
+            <w:r>
+              <w:t>Real-world (UCI)</w:t>
+            </w:r>
+          </w:p>
+        </w:tc>
+        <w:tc>
+          <w:tcPr>
+            <w:tcW w:type="dxa" w:w="3489"/>
+          </w:tcPr>
+          <w:p>
+            <w:pPr>
+              <w:jc w:val="center"/>
+            </w:pPr>
+            <w:r/>
+            <w:r>
+              <w:t>303</w:t>
+            </w:r>
+          </w:p>
+        </w:tc>
+        <w:tc>
+          <w:tcPr>
+            <w:tcW w:type="dxa" w:w="3489"/>
+          </w:tcPr>
+          <w:p>
+            <w:pPr>
+              <w:jc w:val="center"/>
+            </w:pPr>
+            <w:r/>
+            <w:r>
+              <w:t>Cleveland Heart Disease</w:t>
+            </w:r>
+          </w:p>
+        </w:tc>
+      </w:tr>
+      <w:tr>
+        <w:tc>
+          <w:tcPr>
+            <w:tcW w:type="dxa" w:w="3489"/>
+          </w:tcPr>
+          <w:p>
+            <w:pPr>
+              <w:jc w:val="center"/>
+            </w:pPr>
+            <w:r/>
+            <w:r>
+              <w:t>wine_quality.csv</w:t>
+            </w:r>
+          </w:p>
+        </w:tc>
+        <w:tc>
+          <w:tcPr>
+            <w:tcW w:type="dxa" w:w="3489"/>
+          </w:tcPr>
+          <w:p>
+            <w:pPr>
+              <w:jc w:val="center"/>
+            </w:pPr>
+            <w:r/>
+            <w:r>
+              <w:t>Real-world (UCI)</w:t>
+            </w:r>
+          </w:p>
+        </w:tc>
+        <w:tc>
+          <w:tcPr>
+            <w:tcW w:type="dxa" w:w="3489"/>
+          </w:tcPr>
+          <w:p>
+            <w:pPr>
+              <w:jc w:val="center"/>
+            </w:pPr>
+            <w:r/>
+            <w:r>
+              <w:t>1,599</w:t>
+            </w:r>
+          </w:p>
+        </w:tc>
+        <w:tc>
+          <w:tcPr>
+            <w:tcW w:type="dxa" w:w="3489"/>
+          </w:tcPr>
+          <w:p>
+            <w:pPr>
+              <w:jc w:val="center"/>
+            </w:pPr>
+            <w:r/>
+            <w:r>
+              <w:t>Wine Quality (red wine)</w:t>
+            </w:r>
+          </w:p>
+        </w:tc>
+      </w:tr>
+    </w:tbl>
+    <w:p>
+      <w:pPr>
+        <w:pStyle w:val="Cita"/>
+      </w:pPr>
+      <w:r>
+        <w:t>Table 3.1. Datasets used in the experimental evaluation suite.</w:t>
+      </w:r>
+    </w:p>
+    <w:p>
+      <w:pPr>
+        <w:pStyle w:val="Ttulo2"/>
+      </w:pPr>
+      <w:r>
+        <w:t>3.2 Dataset Readiness Scores</w:t>
+      </w:r>
+    </w:p>
+    <w:p>
+      <w:pPr/>
+      <w:r>
+        <w:t>Table 3.2 reports the Dataset Readiness Score (Chapter 2, Phase 10) for the five principal evaluation datasets, each subjected to the full 21-check pipeline. The clean control dataset achieves the maximum grade A (95/100) with zero failed checks, confirming the absence of false positives. Datasets containing deliberately injected quality and leakage issues are correctly downgraded to grades B and C, with the leaky_dataset case flagged primarily through the leakage dimension and the dirty_dataset case through the quality and sufficiency dimensions.</w:t>
+      </w:r>
+    </w:p>
+    <w:tbl>
+      <w:tblPr>
+        <w:tblStyle w:val="Tablaconcuadrcula4-nfasis1"/>
+        <w:tblW w:type="auto" w:w="0"/>
+        <w:tblLook w:val="04A0" w:firstRow="1" w:lastRow="0" w:firstColumn="1" w:lastColumn="0" w:noHBand="0" w:noVBand="1"/>
+      </w:tblPr>
+      <w:tblGrid>
+        <w:gridCol w:w="2792"/>
+        <w:gridCol w:w="2792"/>
+        <w:gridCol w:w="2792"/>
+        <w:gridCol w:w="2792"/>
+        <w:gridCol w:w="2792"/>
+      </w:tblGrid>
+      <w:tr>
+        <w:tc>
+          <w:tcPr>
+            <w:tcW w:type="dxa" w:w="2792"/>
+          </w:tcPr>
+          <w:p>
+            <w:pPr>
+              <w:jc w:val="center"/>
+            </w:pPr>
+            <w:r/>
+            <w:r>
+              <w:t>Dataset</w:t>
+            </w:r>
+          </w:p>
+        </w:tc>
+        <w:tc>
+          <w:tcPr>
+            <w:tcW w:type="dxa" w:w="2792"/>
+          </w:tcPr>
+          <w:p>
+            <w:pPr>
+              <w:jc w:val="center"/>
+            </w:pPr>
+            <w:r/>
+            <w:r>
+              <w:t>Score</w:t>
+            </w:r>
+          </w:p>
+        </w:tc>
+        <w:tc>
+          <w:tcPr>
+            <w:tcW w:type="dxa" w:w="2792"/>
+          </w:tcPr>
+          <w:p>
+            <w:pPr>
+              <w:jc w:val="center"/>
+            </w:pPr>
+            <w:r/>
+            <w:r>
+              <w:t>Grade</w:t>
+            </w:r>
+          </w:p>
+        </w:tc>
+        <w:tc>
+          <w:tcPr>
+            <w:tcW w:type="dxa" w:w="2792"/>
+          </w:tcPr>
+          <w:p>
+            <w:pPr>
+              <w:jc w:val="center"/>
+            </w:pPr>
+            <w:r/>
+            <w:r>
+              <w:t>Pass / Total</w:t>
+            </w:r>
+          </w:p>
+        </w:tc>
+        <w:tc>
+          <w:tcPr>
+            <w:tcW w:type="dxa" w:w="2792"/>
+          </w:tcPr>
+          <w:p>
+            <w:pPr>
+              <w:jc w:val="center"/>
+            </w:pPr>
+            <w:r/>
+            <w:r>
+              <w:t>Key findings</w:t>
+            </w:r>
+          </w:p>
+        </w:tc>
+      </w:tr>
+      <w:tr>
+        <w:tc>
+          <w:tcPr>
+            <w:tcW w:type="dxa" w:w="2792"/>
+          </w:tcPr>
+          <w:p>
+            <w:pPr>
+              <w:jc w:val="center"/>
+            </w:pPr>
+            <w:r/>
+            <w:r>
+              <w:t>clean_dataset</w:t>
+            </w:r>
+          </w:p>
+        </w:tc>
+        <w:tc>
+          <w:tcPr>
+            <w:tcW w:type="dxa" w:w="2792"/>
+          </w:tcPr>
+          <w:p>
+            <w:pPr>
+              <w:jc w:val="center"/>
+            </w:pPr>
+            <w:r/>
+            <w:r>
+              <w:t>95.0</w:t>
+            </w:r>
+          </w:p>
+        </w:tc>
+        <w:tc>
+          <w:tcPr>
+            <w:tcW w:type="dxa" w:w="2792"/>
+          </w:tcPr>
+          <w:p>
+            <w:pPr>
+              <w:jc w:val="center"/>
+            </w:pPr>
+            <w:r/>
+            <w:r>
+              <w:t>A</w:t>
+            </w:r>
+          </w:p>
+        </w:tc>
+        <w:tc>
+          <w:tcPr>
+            <w:tcW w:type="dxa" w:w="2792"/>
+          </w:tcPr>
+          <w:p>
+            <w:pPr>
+              <w:jc w:val="center"/>
+            </w:pPr>
+            <w:r/>
+            <w:r>
+              <w:t>21/21</w:t>
+            </w:r>
+          </w:p>
+        </w:tc>
+        <w:tc>
+          <w:tcPr>
+            <w:tcW w:type="dxa" w:w="2792"/>
+          </w:tcPr>
+          <w:p>
+            <w:pPr>
+              <w:jc w:val="center"/>
+            </w:pPr>
+            <w:r/>
+            <w:r>
+              <w:t>Zero false positives</w:t>
+            </w:r>
+          </w:p>
+        </w:tc>
+      </w:tr>
+      <w:tr>
+        <w:tc>
+          <w:tcPr>
+            <w:tcW w:type="dxa" w:w="2792"/>
+          </w:tcPr>
+          <w:p>
+            <w:pPr>
+              <w:jc w:val="center"/>
+            </w:pPr>
+            <w:r/>
+            <w:r>
+              <w:t>dirty_dataset</w:t>
+            </w:r>
+          </w:p>
+        </w:tc>
+        <w:tc>
+          <w:tcPr>
+            <w:tcW w:type="dxa" w:w="2792"/>
+          </w:tcPr>
+          <w:p>
+            <w:pPr>
+              <w:jc w:val="center"/>
+            </w:pPr>
+            <w:r/>
+            <w:r>
+              <w:t>65.0</w:t>
+            </w:r>
+          </w:p>
+        </w:tc>
+        <w:tc>
+          <w:tcPr>
+            <w:tcW w:type="dxa" w:w="2792"/>
+          </w:tcPr>
+          <w:p>
+            <w:pPr>
+              <w:jc w:val="center"/>
+            </w:pPr>
+            <w:r/>
+            <w:r>
+              <w:t>C</w:t>
+            </w:r>
+          </w:p>
+        </w:tc>
+        <w:tc>
+          <w:tcPr>
+            <w:tcW w:type="dxa" w:w="2792"/>
+          </w:tcPr>
+          <w:p>
+            <w:pPr>
+              <w:jc w:val="center"/>
+            </w:pPr>
+            <w:r/>
+            <w:r>
+              <w:t>12/21</w:t>
+            </w:r>
+          </w:p>
+        </w:tc>
+        <w:tc>
+          <w:tcPr>
+            <w:tcW w:type="dxa" w:w="2792"/>
+          </w:tcPr>
+          <w:p>
+            <w:pPr>
+              <w:jc w:val="center"/>
+            </w:pPr>
+            <w:r/>
+            <w:r>
+              <w:t>5 quality issues, 2 sufficiency issues</w:t>
+            </w:r>
+          </w:p>
+        </w:tc>
+      </w:tr>
+      <w:tr>
+        <w:tc>
+          <w:tcPr>
+            <w:tcW w:type="dxa" w:w="2792"/>
+          </w:tcPr>
+          <w:p>
+            <w:pPr>
+              <w:jc w:val="center"/>
+            </w:pPr>
+            <w:r/>
+            <w:r>
+              <w:t>leaky_dataset</w:t>
+            </w:r>
+          </w:p>
+        </w:tc>
+        <w:tc>
+          <w:tcPr>
+            <w:tcW w:type="dxa" w:w="2792"/>
+          </w:tcPr>
+          <w:p>
+            <w:pPr>
+              <w:jc w:val="center"/>
+            </w:pPr>
+            <w:r/>
+            <w:r>
+              <w:t>72.0</w:t>
+            </w:r>
+          </w:p>
+        </w:tc>
+        <w:tc>
+          <w:tcPr>
+            <w:tcW w:type="dxa" w:w="2792"/>
+          </w:tcPr>
+          <w:p>
+            <w:pPr>
+              <w:jc w:val="center"/>
+            </w:pPr>
+            <w:r/>
+            <w:r>
+              <w:t>B</w:t>
+            </w:r>
+          </w:p>
+        </w:tc>
+        <w:tc>
+          <w:tcPr>
+            <w:tcW w:type="dxa" w:w="2792"/>
+          </w:tcPr>
+          <w:p>
+            <w:pPr>
+              <w:jc w:val="center"/>
+            </w:pPr>
+            <w:r/>
+            <w:r>
+              <w:t>11/21</w:t>
+            </w:r>
+          </w:p>
+        </w:tc>
+        <w:tc>
+          <w:tcPr>
+            <w:tcW w:type="dxa" w:w="2792"/>
+          </w:tcPr>
+          <w:p>
+            <w:pPr>
+              <w:jc w:val="center"/>
+            </w:pPr>
+            <w:r/>
+            <w:r>
+              <w:t>Proxy, temporal, and ID-column leakage</w:t>
+            </w:r>
+          </w:p>
+        </w:tc>
+      </w:tr>
+      <w:tr>
+        <w:tc>
+          <w:tcPr>
+            <w:tcW w:type="dxa" w:w="2792"/>
+          </w:tcPr>
+          <w:p>
+            <w:pPr>
+              <w:jc w:val="center"/>
+            </w:pPr>
+            <w:r/>
+            <w:r>
+              <w:t>Titanic</w:t>
+            </w:r>
+          </w:p>
+        </w:tc>
+        <w:tc>
+          <w:tcPr>
+            <w:tcW w:type="dxa" w:w="2792"/>
+          </w:tcPr>
+          <w:p>
+            <w:pPr>
+              <w:jc w:val="center"/>
+            </w:pPr>
+            <w:r/>
+            <w:r>
+              <w:t>75.0</w:t>
+            </w:r>
+          </w:p>
+        </w:tc>
+        <w:tc>
+          <w:tcPr>
+            <w:tcW w:type="dxa" w:w="2792"/>
+          </w:tcPr>
+          <w:p>
+            <w:pPr>
+              <w:jc w:val="center"/>
+            </w:pPr>
+            <w:r/>
+            <w:r>
+              <w:t>B</w:t>
+            </w:r>
+          </w:p>
+        </w:tc>
+        <w:tc>
+          <w:tcPr>
+            <w:tcW w:type="dxa" w:w="2792"/>
+          </w:tcPr>
+          <w:p>
+            <w:pPr>
+              <w:jc w:val="center"/>
+            </w:pPr>
+            <w:r/>
+            <w:r>
+              <w:t>17/21</w:t>
+            </w:r>
+          </w:p>
+        </w:tc>
+        <w:tc>
+          <w:tcPr>
+            <w:tcW w:type="dxa" w:w="2792"/>
+          </w:tcPr>
+          <w:p>
+            <w:pPr>
+              <w:jc w:val="center"/>
+            </w:pPr>
+            <w:r/>
+            <w:r>
+              <w:t>boat column, r = 0.97</w:t>
+            </w:r>
+          </w:p>
+        </w:tc>
+      </w:tr>
+      <w:tr>
+        <w:tc>
+          <w:tcPr>
+            <w:tcW w:type="dxa" w:w="2792"/>
+          </w:tcPr>
+          <w:p>
+            <w:pPr>
+              <w:jc w:val="center"/>
+            </w:pPr>
+            <w:r/>
+            <w:r>
+              <w:t>Pima Diabetes</w:t>
+            </w:r>
+          </w:p>
+        </w:tc>
+        <w:tc>
+          <w:tcPr>
+            <w:tcW w:type="dxa" w:w="2792"/>
+          </w:tcPr>
+          <w:p>
+            <w:pPr>
+              <w:jc w:val="center"/>
+            </w:pPr>
+            <w:r/>
+            <w:r>
+              <w:t>80.0</w:t>
+            </w:r>
+          </w:p>
+        </w:tc>
+        <w:tc>
+          <w:tcPr>
+            <w:tcW w:type="dxa" w:w="2792"/>
+          </w:tcPr>
+          <w:p>
+            <w:pPr>
+              <w:jc w:val="center"/>
+            </w:pPr>
+            <w:r/>
+            <w:r>
+              <w:t>B</w:t>
+            </w:r>
+          </w:p>
+        </w:tc>
+        <w:tc>
+          <w:tcPr>
+            <w:tcW w:type="dxa" w:w="2792"/>
+          </w:tcPr>
+          <w:p>
+            <w:pPr>
+              <w:jc w:val="center"/>
+            </w:pPr>
+            <w:r/>
+            <w:r>
+              <w:t>20/21</w:t>
+            </w:r>
+          </w:p>
+        </w:tc>
+        <w:tc>
+          <w:tcPr>
+            <w:tcW w:type="dxa" w:w="2792"/>
+          </w:tcPr>
+          <w:p>
+            <w:pPr>
+              <w:jc w:val="center"/>
+            </w:pPr>
+            <w:r/>
+            <w:r>
+              <w:t>51 physiologically impossible outliers</w:t>
+            </w:r>
+          </w:p>
+        </w:tc>
+      </w:tr>
+    </w:tbl>
+    <w:p>
+      <w:pPr>
+        <w:pStyle w:val="Cita"/>
+      </w:pPr>
+      <w:r>
+        <w:t>Table 3.2. Readiness scores on the five principal evaluation datasets (21 checks each).</w:t>
+      </w:r>
+    </w:p>
+    <w:p>
+      <w:pPr/>
+      <w:r>
+        <w:t>Table 3.3 extends the evaluation to four additional real-world datasets, demonstrating the framework's behaviour across different domains, sizes, and feature types. The Adult Census Income dataset (48,842 rows) scores 68/100 (C), driven primarily by significant class imbalance (the income &gt; 50K class accounts for only 23.9% of records) and high missing rates in the workclass and occupation columns. German Credit scores 74/100 (B): although well-curated by construction, its 70/30 class split triggers a class-imbalance warning and several categorical features show high within-class correlation. Heart Disease (303 rows) scores only 62/100 (C), with the sufficiency module reporting a sample-to-feature ratio of n/p = 21.6 (below the recommended threshold of 50) and high correlation between thalach and age. Wine Quality achieves the highest score among the UCI group at 82/100 (B), with no leakage detected and well-behaved feature distributions, the main penalty arising from class imbalance and skewness in the residual sugar feature.</w:t>
+      </w:r>
+    </w:p>
+    <w:tbl>
+      <w:tblPr>
+        <w:tblStyle w:val="Tablaconcuadrcula4-nfasis1"/>
+        <w:tblW w:type="auto" w:w="0"/>
+        <w:tblLook w:val="04A0" w:firstRow="1" w:lastRow="0" w:firstColumn="1" w:lastColumn="0" w:noHBand="0" w:noVBand="1"/>
+      </w:tblPr>
+      <w:tblGrid>
+        <w:gridCol w:w="2792"/>
+        <w:gridCol w:w="2792"/>
+        <w:gridCol w:w="2792"/>
+        <w:gridCol w:w="2792"/>
+        <w:gridCol w:w="2792"/>
+      </w:tblGrid>
+      <w:tr>
+        <w:tc>
+          <w:tcPr>
+            <w:tcW w:type="dxa" w:w="2792"/>
+          </w:tcPr>
+          <w:p>
+            <w:pPr>
+              <w:jc w:val="center"/>
+            </w:pPr>
+            <w:r/>
+            <w:r>
+              <w:t>Dataset</w:t>
+            </w:r>
+          </w:p>
+        </w:tc>
+        <w:tc>
+          <w:tcPr>
+            <w:tcW w:type="dxa" w:w="2792"/>
+          </w:tcPr>
+          <w:p>
+            <w:pPr>
+              <w:jc w:val="center"/>
+            </w:pPr>
+            <w:r/>
+            <w:r>
+              <w:t>Score</w:t>
+            </w:r>
+          </w:p>
+        </w:tc>
+        <w:tc>
+          <w:tcPr>
+            <w:tcW w:type="dxa" w:w="2792"/>
+          </w:tcPr>
+          <w:p>
+            <w:pPr>
+              <w:jc w:val="center"/>
+            </w:pPr>
+            <w:r/>
+            <w:r>
+              <w:t>Grade</w:t>
+            </w:r>
+          </w:p>
+        </w:tc>
+        <w:tc>
+          <w:tcPr>
+            <w:tcW w:type="dxa" w:w="2792"/>
+          </w:tcPr>
+          <w:p>
+            <w:pPr>
+              <w:jc w:val="center"/>
+            </w:pPr>
+            <w:r/>
+            <w:r>
+              <w:t>Pass / Total</w:t>
+            </w:r>
+          </w:p>
+        </w:tc>
+        <w:tc>
+          <w:tcPr>
+            <w:tcW w:type="dxa" w:w="2792"/>
+          </w:tcPr>
+          <w:p>
+            <w:pPr>
+              <w:jc w:val="center"/>
+            </w:pPr>
+            <w:r/>
+            <w:r>
+              <w:t>Primary issues detected</w:t>
+            </w:r>
+          </w:p>
+        </w:tc>
+      </w:tr>
+      <w:tr>
+        <w:tc>
+          <w:tcPr>
+            <w:tcW w:type="dxa" w:w="2792"/>
+          </w:tcPr>
+          <w:p>
+            <w:pPr>
+              <w:jc w:val="center"/>
+            </w:pPr>
+            <w:r/>
+            <w:r>
+              <w:t>Adult Census</w:t>
+            </w:r>
+          </w:p>
+        </w:tc>
+        <w:tc>
+          <w:tcPr>
+            <w:tcW w:type="dxa" w:w="2792"/>
+          </w:tcPr>
+          <w:p>
+            <w:pPr>
+              <w:jc w:val="center"/>
+            </w:pPr>
+            <w:r/>
+            <w:r>
+              <w:t>68</w:t>
+            </w:r>
+          </w:p>
+        </w:tc>
+        <w:tc>
+          <w:tcPr>
+            <w:tcW w:type="dxa" w:w="2792"/>
+          </w:tcPr>
+          <w:p>
+            <w:pPr>
+              <w:jc w:val="center"/>
+            </w:pPr>
+            <w:r/>
+            <w:r>
+              <w:t>C</w:t>
+            </w:r>
+          </w:p>
+        </w:tc>
+        <w:tc>
+          <w:tcPr>
+            <w:tcW w:type="dxa" w:w="2792"/>
+          </w:tcPr>
+          <w:p>
+            <w:pPr>
+              <w:jc w:val="center"/>
+            </w:pPr>
+            <w:r/>
+            <w:r>
+              <w:t>13/21</w:t>
+            </w:r>
+          </w:p>
+        </w:tc>
+        <w:tc>
+          <w:tcPr>
+            <w:tcW w:type="dxa" w:w="2792"/>
+          </w:tcPr>
+          <w:p>
+            <w:pPr>
+              <w:jc w:val="center"/>
+            </w:pPr>
+            <w:r/>
+            <w:r>
+              <w:t>Class imbalance (76/24); missing values in 2 columns; low MI relevance in fnlwgt</w:t>
+            </w:r>
+          </w:p>
+        </w:tc>
+      </w:tr>
+      <w:tr>
+        <w:tc>
+          <w:tcPr>
+            <w:tcW w:type="dxa" w:w="2792"/>
+          </w:tcPr>
+          <w:p>
+            <w:pPr>
+              <w:jc w:val="center"/>
+            </w:pPr>
+            <w:r/>
+            <w:r>
+              <w:t>German Credit</w:t>
+            </w:r>
+          </w:p>
+        </w:tc>
+        <w:tc>
+          <w:tcPr>
+            <w:tcW w:type="dxa" w:w="2792"/>
+          </w:tcPr>
+          <w:p>
+            <w:pPr>
+              <w:jc w:val="center"/>
+            </w:pPr>
+            <w:r/>
+            <w:r>
+              <w:t>74</w:t>
+            </w:r>
+          </w:p>
+        </w:tc>
+        <w:tc>
+          <w:tcPr>
+            <w:tcW w:type="dxa" w:w="2792"/>
+          </w:tcPr>
+          <w:p>
+            <w:pPr>
+              <w:jc w:val="center"/>
+            </w:pPr>
+            <w:r/>
+            <w:r>
+              <w:t>B</w:t>
+            </w:r>
+          </w:p>
+        </w:tc>
+        <w:tc>
+          <w:tcPr>
+            <w:tcW w:type="dxa" w:w="2792"/>
+          </w:tcPr>
+          <w:p>
+            <w:pPr>
+              <w:jc w:val="center"/>
+            </w:pPr>
+            <w:r/>
+            <w:r>
+              <w:t>16/21</w:t>
+            </w:r>
+          </w:p>
+        </w:tc>
+        <w:tc>
+          <w:tcPr>
+            <w:tcW w:type="dxa" w:w="2792"/>
+          </w:tcPr>
+          <w:p>
+            <w:pPr>
+              <w:jc w:val="center"/>
+            </w:pPr>
+            <w:r/>
+            <w:r>
+              <w:t>Class imbalance (70/30); high correlation between credit features</w:t>
+            </w:r>
+          </w:p>
+        </w:tc>
+      </w:tr>
+      <w:tr>
+        <w:tc>
+          <w:tcPr>
+            <w:tcW w:type="dxa" w:w="2792"/>
+          </w:tcPr>
+          <w:p>
+            <w:pPr>
+              <w:jc w:val="center"/>
+            </w:pPr>
+            <w:r/>
+            <w:r>
+              <w:t>Heart Disease</w:t>
+            </w:r>
+          </w:p>
+        </w:tc>
+        <w:tc>
+          <w:tcPr>
+            <w:tcW w:type="dxa" w:w="2792"/>
+          </w:tcPr>
+          <w:p>
+            <w:pPr>
+              <w:jc w:val="center"/>
+            </w:pPr>
+            <w:r/>
+            <w:r>
+              <w:t>62</w:t>
+            </w:r>
+          </w:p>
+        </w:tc>
+        <w:tc>
+          <w:tcPr>
+            <w:tcW w:type="dxa" w:w="2792"/>
+          </w:tcPr>
+          <w:p>
+            <w:pPr>
+              <w:jc w:val="center"/>
+            </w:pPr>
+            <w:r/>
+            <w:r>
+              <w:t>C</w:t>
+            </w:r>
+          </w:p>
+        </w:tc>
+        <w:tc>
+          <w:tcPr>
+            <w:tcW w:type="dxa" w:w="2792"/>
+          </w:tcPr>
+          <w:p>
+            <w:pPr>
+              <w:jc w:val="center"/>
+            </w:pPr>
+            <w:r/>
+            <w:r>
+              <w:t>11/21</w:t>
+            </w:r>
+          </w:p>
+        </w:tc>
+        <w:tc>
+          <w:tcPr>
+            <w:tcW w:type="dxa" w:w="2792"/>
+          </w:tcPr>
+          <w:p>
+            <w:pPr>
+              <w:jc w:val="center"/>
+            </w:pPr>
+            <w:r/>
+            <w:r>
+              <w:t>Low n/p = 21.6; inter-feature correlation; 6 outlier columns</w:t>
+            </w:r>
+          </w:p>
+        </w:tc>
+      </w:tr>
+      <w:tr>
+        <w:tc>
+          <w:tcPr>
+            <w:tcW w:type="dxa" w:w="2792"/>
+          </w:tcPr>
+          <w:p>
+            <w:pPr>
+              <w:jc w:val="center"/>
+            </w:pPr>
+            <w:r/>
+            <w:r>
+              <w:t>Wine Quality</w:t>
+            </w:r>
+          </w:p>
+        </w:tc>
+        <w:tc>
+          <w:tcPr>
+            <w:tcW w:type="dxa" w:w="2792"/>
+          </w:tcPr>
+          <w:p>
+            <w:pPr>
+              <w:jc w:val="center"/>
+            </w:pPr>
+            <w:r/>
+            <w:r>
+              <w:t>82</w:t>
+            </w:r>
+          </w:p>
+        </w:tc>
+        <w:tc>
+          <w:tcPr>
+            <w:tcW w:type="dxa" w:w="2792"/>
+          </w:tcPr>
+          <w:p>
+            <w:pPr>
+              <w:jc w:val="center"/>
+            </w:pPr>
+            <w:r/>
+            <w:r>
+              <w:t>B</w:t>
+            </w:r>
+          </w:p>
+        </w:tc>
+        <w:tc>
+          <w:tcPr>
+            <w:tcW w:type="dxa" w:w="2792"/>
+          </w:tcPr>
+          <w:p>
+            <w:pPr>
+              <w:jc w:val="center"/>
+            </w:pPr>
+            <w:r/>
+            <w:r>
+              <w:t>18/21</w:t>
+            </w:r>
+          </w:p>
+        </w:tc>
+        <w:tc>
+          <w:tcPr>
+            <w:tcW w:type="dxa" w:w="2792"/>
+          </w:tcPr>
+          <w:p>
+            <w:pPr>
+              <w:jc w:val="center"/>
+            </w:pPr>
+            <w:r/>
+            <w:r>
+              <w:t>Mild class imbalance; skewness in residual sugar</w:t>
+            </w:r>
+          </w:p>
+        </w:tc>
+      </w:tr>
+    </w:tbl>
+    <w:p>
+      <w:pPr>
+        <w:pStyle w:val="Cita"/>
+      </w:pPr>
+      <w:r>
+        <w:t>Table 3.3. Readiness scores on four additional UCI/OpenML datasets.</w:t>
+      </w:r>
+    </w:p>
+    <w:p>
+      <w:pPr>
+        <w:pStyle w:val="Ttulo2"/>
+      </w:pPr>
+      <w:r>
+        <w:t>3.3 Impact Analysis: Quantifying the Cost of Leakage</w:t>
+      </w:r>
+    </w:p>
+    <w:p>
+      <w:pPr/>
+      <w:r>
+        <w:t>To quantify the practical effect of the leakage detected in leaky_dataset, the impact analysis module (Phase 5) trains three classifiers — logistic regression, random forest, and XGBoost — twice: once on the full feature set, and once after removing all features flagged by the leakage checks. Table 3.4 reports the 5-fold cross-validated accuracy of each model before and after cleaning. In all three cases, accuracy drops from a perfect 1.000 to between 0.951 and 0.954, a decrease of 4.6–4.9 percentage points. This confirms that the apparent perfect performance was entirely attributable to leaked information rather than genuine predictive signal, and demonstrates that the framework's leakage flags correspond to a measurable, model-independent effect on generalisation.</w:t>
+      </w:r>
+    </w:p>
+    <w:tbl>
+      <w:tblPr>
+        <w:tblStyle w:val="Tablaconcuadrcula4-nfasis1"/>
+        <w:tblW w:type="auto" w:w="0"/>
+        <w:tblLook w:val="04A0" w:firstRow="1" w:lastRow="0" w:firstColumn="1" w:lastColumn="0" w:noHBand="0" w:noVBand="1"/>
+      </w:tblPr>
+      <w:tblGrid>
+        <w:gridCol w:w="3489"/>
+        <w:gridCol w:w="3489"/>
+        <w:gridCol w:w="3489"/>
+        <w:gridCol w:w="3489"/>
+      </w:tblGrid>
+      <w:tr>
+        <w:tc>
+          <w:tcPr>
+            <w:tcW w:type="dxa" w:w="3489"/>
+          </w:tcPr>
+          <w:p>
+            <w:pPr>
+              <w:jc w:val="center"/>
+            </w:pPr>
+            <w:r/>
+            <w:r>
+              <w:t>Model</w:t>
+            </w:r>
+          </w:p>
+        </w:tc>
+        <w:tc>
+          <w:tcPr>
+            <w:tcW w:type="dxa" w:w="3489"/>
+          </w:tcPr>
+          <w:p>
+            <w:pPr>
+              <w:jc w:val="center"/>
+            </w:pPr>
+            <w:r/>
+            <w:r>
+              <w:t>Baseline accuracy</w:t>
+            </w:r>
+          </w:p>
+        </w:tc>
+        <w:tc>
+          <w:tcPr>
+            <w:tcW w:type="dxa" w:w="3489"/>
+          </w:tcPr>
+          <w:p>
+            <w:pPr>
+              <w:jc w:val="center"/>
+            </w:pPr>
+            <w:r/>
+            <w:r>
+              <w:t>Cleaned accuracy</w:t>
+            </w:r>
+          </w:p>
+        </w:tc>
+        <w:tc>
+          <w:tcPr>
+            <w:tcW w:type="dxa" w:w="3489"/>
+          </w:tcPr>
+          <w:p>
+            <w:pPr>
+              <w:jc w:val="center"/>
+            </w:pPr>
+            <w:r/>
+            <w:r>
+              <w:t>Δ</w:t>
+            </w:r>
+          </w:p>
+        </w:tc>
+      </w:tr>
+      <w:tr>
+        <w:tc>
+          <w:tcPr>
+            <w:tcW w:type="dxa" w:w="3489"/>
+          </w:tcPr>
+          <w:p>
+            <w:pPr>
+              <w:jc w:val="center"/>
+            </w:pPr>
+            <w:r/>
+            <w:r>
+              <w:t>Logistic Regression</w:t>
+            </w:r>
+          </w:p>
+        </w:tc>
+        <w:tc>
+          <w:tcPr>
+            <w:tcW w:type="dxa" w:w="3489"/>
+          </w:tcPr>
+          <w:p>
+            <w:pPr>
+              <w:jc w:val="center"/>
+            </w:pPr>
+            <w:r/>
+            <w:r>
+              <w:t>1.000 ± 0.000</w:t>
+            </w:r>
+          </w:p>
+        </w:tc>
+        <w:tc>
+          <w:tcPr>
+            <w:tcW w:type="dxa" w:w="3489"/>
+          </w:tcPr>
+          <w:p>
+            <w:pPr>
+              <w:jc w:val="center"/>
+            </w:pPr>
+            <w:r/>
+            <w:r>
+              <w:t>0.952 ± 0.008</w:t>
+            </w:r>
+          </w:p>
+        </w:tc>
+        <w:tc>
+          <w:tcPr>
+            <w:tcW w:type="dxa" w:w="3489"/>
+          </w:tcPr>
+          <w:p>
+            <w:pPr>
+              <w:jc w:val="center"/>
+            </w:pPr>
+            <w:r/>
+            <w:r>
+              <w:t>−0.048</w:t>
+            </w:r>
+          </w:p>
+        </w:tc>
+      </w:tr>
+      <w:tr>
+        <w:tc>
+          <w:tcPr>
+            <w:tcW w:type="dxa" w:w="3489"/>
+          </w:tcPr>
+          <w:p>
+            <w:pPr>
+              <w:jc w:val="center"/>
+            </w:pPr>
+            <w:r/>
+            <w:r>
+              <w:t>Random Forest</w:t>
+            </w:r>
+          </w:p>
+        </w:tc>
+        <w:tc>
+          <w:tcPr>
+            <w:tcW w:type="dxa" w:w="3489"/>
+          </w:tcPr>
+          <w:p>
+            <w:pPr>
+              <w:jc w:val="center"/>
+            </w:pPr>
+            <w:r/>
+            <w:r>
+              <w:t>1.000 ± 0.000</w:t>
+            </w:r>
+          </w:p>
+        </w:tc>
+        <w:tc>
+          <w:tcPr>
+            <w:tcW w:type="dxa" w:w="3489"/>
+          </w:tcPr>
+          <w:p>
+            <w:pPr>
+              <w:jc w:val="center"/>
+            </w:pPr>
+            <w:r/>
+            <w:r>
+              <w:t>0.954 ± 0.010</w:t>
+            </w:r>
+          </w:p>
+        </w:tc>
+        <w:tc>
+          <w:tcPr>
+            <w:tcW w:type="dxa" w:w="3489"/>
+          </w:tcPr>
+          <w:p>
+            <w:pPr>
+              <w:jc w:val="center"/>
+            </w:pPr>
+            <w:r/>
+            <w:r>
+              <w:t>−0.046</w:t>
+            </w:r>
+          </w:p>
+        </w:tc>
+      </w:tr>
+      <w:tr>
+        <w:tc>
+          <w:tcPr>
+            <w:tcW w:type="dxa" w:w="3489"/>
+          </w:tcPr>
+          <w:p>
+            <w:pPr>
+              <w:jc w:val="center"/>
+            </w:pPr>
+            <w:r/>
+            <w:r>
+              <w:t>XGBoost</w:t>
+            </w:r>
+          </w:p>
+        </w:tc>
+        <w:tc>
+          <w:tcPr>
+            <w:tcW w:type="dxa" w:w="3489"/>
+          </w:tcPr>
+          <w:p>
+            <w:pPr>
+              <w:jc w:val="center"/>
+            </w:pPr>
+            <w:r/>
+            <w:r>
+              <w:t>1.000 ± 0.000</w:t>
+            </w:r>
+          </w:p>
+        </w:tc>
+        <w:tc>
+          <w:tcPr>
+            <w:tcW w:type="dxa" w:w="3489"/>
+          </w:tcPr>
+          <w:p>
+            <w:pPr>
+              <w:jc w:val="center"/>
+            </w:pPr>
+            <w:r/>
+            <w:r>
+              <w:t>0.951 ± 0.009</w:t>
+            </w:r>
+          </w:p>
+        </w:tc>
+        <w:tc>
+          <w:tcPr>
+            <w:tcW w:type="dxa" w:w="3489"/>
+          </w:tcPr>
+          <w:p>
+            <w:pPr>
+              <w:jc w:val="center"/>
+            </w:pPr>
+            <w:r/>
+            <w:r>
+              <w:t>−0.049</w:t>
+            </w:r>
+          </w:p>
+        </w:tc>
+      </w:tr>
+    </w:tbl>
+    <w:p>
+      <w:pPr>
+        <w:pStyle w:val="Cita"/>
+      </w:pPr>
+      <w:r>
+        <w:t>Table 3.4. Impact analysis on leaky_dataset: 5-fold CV accuracy before and after removing leaky features.</w:t>
+      </w:r>
+    </w:p>
+    <w:p>
+      <w:pPr>
+        <w:pStyle w:val="Ttulo2"/>
+      </w:pPr>
+      <w:r>
+        <w:t>3.4 Unified Leakage Risk Score Validation</w:t>
+      </w:r>
+    </w:p>
+    <w:p>
+      <w:pPr/>
+      <w:r>
+        <w:t>The unified leakage risk score L(f) introduced in Phase 16 (Chapter 2, L(f) = 0.35·ρ(f) + 0.35·Ĩ(f;y) + 0.30·π(f)) was validated on representative features from the proxy_leakage, temporal_leakage_ext, and multitype_leakage datasets. Table 3.5 reports the three components (ρ, Ĩ, π) and the resulting score L for five representative features. All three intentionally leaky features achieve L ≥ 0.83, comfortably above the 0.7 warning threshold (and, for the perfect proxy, above the 0.9 error threshold), while the two clean features remain below 0.30. This confirms that the unified score correctly separates leaky from non-leaky features across all three components simultaneously, rather than relying on any single signal in isolation.</w:t>
+      </w:r>
+    </w:p>
+    <w:tbl>
+      <w:tblPr>
+        <w:tblStyle w:val="Tablaconcuadrcula4-nfasis1"/>
+        <w:tblW w:type="auto" w:w="0"/>
+        <w:tblLook w:val="04A0" w:firstRow="1" w:lastRow="0" w:firstColumn="1" w:lastColumn="0" w:noHBand="0" w:noVBand="1"/>
+      </w:tblPr>
+      <w:tblGrid>
+        <w:gridCol w:w="2326"/>
+        <w:gridCol w:w="2326"/>
+        <w:gridCol w:w="2326"/>
+        <w:gridCol w:w="2326"/>
+        <w:gridCol w:w="2326"/>
+        <w:gridCol w:w="2326"/>
+      </w:tblGrid>
+      <w:tr>
+        <w:tc>
+          <w:tcPr>
+            <w:tcW w:type="dxa" w:w="2326"/>
+          </w:tcPr>
+          <w:p>
+            <w:pPr>
+              <w:jc w:val="center"/>
+            </w:pPr>
+            <w:r/>
+            <w:r>
+              <w:t>Feature</w:t>
+            </w:r>
+          </w:p>
+        </w:tc>
+        <w:tc>
+          <w:tcPr>
+            <w:tcW w:type="dxa" w:w="2326"/>
+          </w:tcPr>
+          <w:p>
+            <w:pPr>
+              <w:jc w:val="center"/>
+            </w:pPr>
+            <w:r/>
+            <w:r>
+              <w:t>Type</w:t>
+            </w:r>
+          </w:p>
+        </w:tc>
+        <w:tc>
+          <w:tcPr>
+            <w:tcW w:type="dxa" w:w="2326"/>
+          </w:tcPr>
+          <w:p>
+            <w:pPr>
+              <w:jc w:val="center"/>
+            </w:pPr>
+            <w:r/>
+            <w:r>
+              <w:t>ρ</w:t>
+            </w:r>
+          </w:p>
+        </w:tc>
+        <w:tc>
+          <w:tcPr>
+            <w:tcW w:type="dxa" w:w="2326"/>
+          </w:tcPr>
+          <w:p>
+            <w:pPr>
+              <w:jc w:val="center"/>
+            </w:pPr>
+            <w:r/>
+            <w:r>
+              <w:t>Ĩ</w:t>
+            </w:r>
+          </w:p>
+        </w:tc>
+        <w:tc>
+          <w:tcPr>
+            <w:tcW w:type="dxa" w:w="2326"/>
+          </w:tcPr>
+          <w:p>
+            <w:pPr>
+              <w:jc w:val="center"/>
+            </w:pPr>
+            <w:r/>
+            <w:r>
+              <w:t>π</w:t>
+            </w:r>
+          </w:p>
+        </w:tc>
+        <w:tc>
+          <w:tcPr>
+            <w:tcW w:type="dxa" w:w="2326"/>
+          </w:tcPr>
+          <w:p>
+            <w:pPr>
+              <w:jc w:val="center"/>
+            </w:pPr>
+            <w:r/>
+            <w:r>
+              <w:t>L(f)</w:t>
+            </w:r>
+          </w:p>
+        </w:tc>
+      </w:tr>
+      <w:tr>
+        <w:tc>
+          <w:tcPr>
+            <w:tcW w:type="dxa" w:w="2326"/>
+          </w:tcPr>
+          <w:p>
+            <w:pPr>
+              <w:jc w:val="center"/>
+            </w:pPr>
+            <w:r/>
+            <w:r>
+              <w:t>Perfect proxy (r = 1.0)</w:t>
+            </w:r>
+          </w:p>
+        </w:tc>
+        <w:tc>
+          <w:tcPr>
+            <w:tcW w:type="dxa" w:w="2326"/>
+          </w:tcPr>
+          <w:p>
+            <w:pPr>
+              <w:jc w:val="center"/>
+            </w:pPr>
+            <w:r/>
+            <w:r>
+              <w:t>Leaky</w:t>
+            </w:r>
+          </w:p>
+        </w:tc>
+        <w:tc>
+          <w:tcPr>
+            <w:tcW w:type="dxa" w:w="2326"/>
+          </w:tcPr>
+          <w:p>
+            <w:pPr>
+              <w:jc w:val="center"/>
+            </w:pPr>
+            <w:r/>
+            <w:r>
+              <w:t>1.00</w:t>
+            </w:r>
+          </w:p>
+        </w:tc>
+        <w:tc>
+          <w:tcPr>
+            <w:tcW w:type="dxa" w:w="2326"/>
+          </w:tcPr>
+          <w:p>
+            <w:pPr>
+              <w:jc w:val="center"/>
+            </w:pPr>
+            <w:r/>
+            <w:r>
+              <w:t>1.00</w:t>
+            </w:r>
+          </w:p>
+        </w:tc>
+        <w:tc>
+          <w:tcPr>
+            <w:tcW w:type="dxa" w:w="2326"/>
+          </w:tcPr>
+          <w:p>
+            <w:pPr>
+              <w:jc w:val="center"/>
+            </w:pPr>
+            <w:r/>
+            <w:r>
+              <w:t>1.00</w:t>
+            </w:r>
+          </w:p>
+        </w:tc>
+        <w:tc>
+          <w:tcPr>
+            <w:tcW w:type="dxa" w:w="2326"/>
+          </w:tcPr>
+          <w:p>
+            <w:pPr>
+              <w:jc w:val="center"/>
+            </w:pPr>
+            <w:r/>
+            <w:r>
+              <w:t>1.000</w:t>
+            </w:r>
+          </w:p>
+        </w:tc>
+      </w:tr>
+      <w:tr>
+        <w:tc>
+          <w:tcPr>
+            <w:tcW w:type="dxa" w:w="2326"/>
+          </w:tcPr>
+          <w:p>
+            <w:pPr>
+              <w:jc w:val="center"/>
+            </w:pPr>
+            <w:r/>
+            <w:r>
+              <w:t>Noisy proxy (r ≈ 0.97)</w:t>
+            </w:r>
+          </w:p>
+        </w:tc>
+        <w:tc>
+          <w:tcPr>
+            <w:tcW w:type="dxa" w:w="2326"/>
+          </w:tcPr>
+          <w:p>
+            <w:pPr>
+              <w:jc w:val="center"/>
+            </w:pPr>
+            <w:r/>
+            <w:r>
+              <w:t>Leaky</w:t>
+            </w:r>
+          </w:p>
+        </w:tc>
+        <w:tc>
+          <w:tcPr>
+            <w:tcW w:type="dxa" w:w="2326"/>
+          </w:tcPr>
+          <w:p>
+            <w:pPr>
+              <w:jc w:val="center"/>
+            </w:pPr>
+            <w:r/>
+            <w:r>
+              <w:t>0.97</w:t>
+            </w:r>
+          </w:p>
+        </w:tc>
+        <w:tc>
+          <w:tcPr>
+            <w:tcW w:type="dxa" w:w="2326"/>
+          </w:tcPr>
+          <w:p>
+            <w:pPr>
+              <w:jc w:val="center"/>
+            </w:pPr>
+            <w:r/>
+            <w:r>
+              <w:t>0.93</w:t>
+            </w:r>
+          </w:p>
+        </w:tc>
+        <w:tc>
+          <w:tcPr>
+            <w:tcW w:type="dxa" w:w="2326"/>
+          </w:tcPr>
+          <w:p>
+            <w:pPr>
+              <w:jc w:val="center"/>
+            </w:pPr>
+            <w:r/>
+            <w:r>
+              <w:t>0.91</w:t>
+            </w:r>
+          </w:p>
+        </w:tc>
+        <w:tc>
+          <w:tcPr>
+            <w:tcW w:type="dxa" w:w="2326"/>
+          </w:tcPr>
+          <w:p>
+            <w:pPr>
+              <w:jc w:val="center"/>
+            </w:pPr>
+            <w:r/>
+            <w:r>
+              <w:t>0.940</w:t>
+            </w:r>
+          </w:p>
+        </w:tc>
+      </w:tr>
+      <w:tr>
+        <w:tc>
+          <w:tcPr>
+            <w:tcW w:type="dxa" w:w="2326"/>
+          </w:tcPr>
+          <w:p>
+            <w:pPr>
+              <w:jc w:val="center"/>
+            </w:pPr>
+            <w:r/>
+            <w:r>
+              <w:t>Indirect feature</w:t>
+            </w:r>
+          </w:p>
+        </w:tc>
+        <w:tc>
+          <w:tcPr>
+            <w:tcW w:type="dxa" w:w="2326"/>
+          </w:tcPr>
+          <w:p>
+            <w:pPr>
+              <w:jc w:val="center"/>
+            </w:pPr>
+            <w:r/>
+            <w:r>
+              <w:t>Leaky</w:t>
+            </w:r>
+          </w:p>
+        </w:tc>
+        <w:tc>
+          <w:tcPr>
+            <w:tcW w:type="dxa" w:w="2326"/>
+          </w:tcPr>
+          <w:p>
+            <w:pPr>
+              <w:jc w:val="center"/>
+            </w:pPr>
+            <w:r/>
+            <w:r>
+              <w:t>0.82</w:t>
+            </w:r>
+          </w:p>
+        </w:tc>
+        <w:tc>
+          <w:tcPr>
+            <w:tcW w:type="dxa" w:w="2326"/>
+          </w:tcPr>
+          <w:p>
+            <w:pPr>
+              <w:jc w:val="center"/>
+            </w:pPr>
+            <w:r/>
+            <w:r>
+              <w:t>0.79</w:t>
+            </w:r>
+          </w:p>
+        </w:tc>
+        <w:tc>
+          <w:tcPr>
+            <w:tcW w:type="dxa" w:w="2326"/>
+          </w:tcPr>
+          <w:p>
+            <w:pPr>
+              <w:jc w:val="center"/>
+            </w:pPr>
+            <w:r/>
+            <w:r>
+              <w:t>0.88</w:t>
+            </w:r>
+          </w:p>
+        </w:tc>
+        <w:tc>
+          <w:tcPr>
+            <w:tcW w:type="dxa" w:w="2326"/>
+          </w:tcPr>
+          <w:p>
+            <w:pPr>
+              <w:jc w:val="center"/>
+            </w:pPr>
+            <w:r/>
+            <w:r>
+              <w:t>0.831</w:t>
+            </w:r>
+          </w:p>
+        </w:tc>
+      </w:tr>
+      <w:tr>
+        <w:tc>
+          <w:tcPr>
+            <w:tcW w:type="dxa" w:w="2326"/>
+          </w:tcPr>
+          <w:p>
+            <w:pPr>
+              <w:jc w:val="center"/>
+            </w:pPr>
+            <w:r/>
+            <w:r>
+              <w:t>age (unrelated)</w:t>
+            </w:r>
+          </w:p>
+        </w:tc>
+        <w:tc>
+          <w:tcPr>
+            <w:tcW w:type="dxa" w:w="2326"/>
+          </w:tcPr>
+          <w:p>
+            <w:pPr>
+              <w:jc w:val="center"/>
+            </w:pPr>
+            <w:r/>
+            <w:r>
+              <w:t>Clean</w:t>
+            </w:r>
+          </w:p>
+        </w:tc>
+        <w:tc>
+          <w:tcPr>
+            <w:tcW w:type="dxa" w:w="2326"/>
+          </w:tcPr>
+          <w:p>
+            <w:pPr>
+              <w:jc w:val="center"/>
+            </w:pPr>
+            <w:r/>
+            <w:r>
+              <w:t>0.04</w:t>
+            </w:r>
+          </w:p>
+        </w:tc>
+        <w:tc>
+          <w:tcPr>
+            <w:tcW w:type="dxa" w:w="2326"/>
+          </w:tcPr>
+          <w:p>
+            <w:pPr>
+              <w:jc w:val="center"/>
+            </w:pPr>
+            <w:r/>
+            <w:r>
+              <w:t>0.07</w:t>
+            </w:r>
+          </w:p>
+        </w:tc>
+        <w:tc>
+          <w:tcPr>
+            <w:tcW w:type="dxa" w:w="2326"/>
+          </w:tcPr>
+          <w:p>
+            <w:pPr>
+              <w:jc w:val="center"/>
+            </w:pPr>
+            <w:r/>
+            <w:r>
+              <w:t>0.06</w:t>
+            </w:r>
+          </w:p>
+        </w:tc>
+        <w:tc>
+          <w:tcPr>
+            <w:tcW w:type="dxa" w:w="2326"/>
+          </w:tcPr>
+          <w:p>
+            <w:pPr>
+              <w:jc w:val="center"/>
+            </w:pPr>
+            <w:r/>
+            <w:r>
+              <w:t>0.057</w:t>
+            </w:r>
+          </w:p>
+        </w:tc>
+      </w:tr>
+      <w:tr>
+        <w:tc>
+          <w:tcPr>
+            <w:tcW w:type="dxa" w:w="2326"/>
+          </w:tcPr>
+          <w:p>
+            <w:pPr>
+              <w:jc w:val="center"/>
+            </w:pPr>
+            <w:r/>
+            <w:r>
+              <w:t>income (moderate)</w:t>
+            </w:r>
+          </w:p>
+        </w:tc>
+        <w:tc>
+          <w:tcPr>
+            <w:tcW w:type="dxa" w:w="2326"/>
+          </w:tcPr>
+          <w:p>
+            <w:pPr>
+              <w:jc w:val="center"/>
+            </w:pPr>
+            <w:r/>
+            <w:r>
+              <w:t>Clean</w:t>
+            </w:r>
+          </w:p>
+        </w:tc>
+        <w:tc>
+          <w:tcPr>
+            <w:tcW w:type="dxa" w:w="2326"/>
+          </w:tcPr>
+          <w:p>
+            <w:pPr>
+              <w:jc w:val="center"/>
+            </w:pPr>
+            <w:r/>
+            <w:r>
+              <w:t>0.28</w:t>
+            </w:r>
+          </w:p>
+        </w:tc>
+        <w:tc>
+          <w:tcPr>
+            <w:tcW w:type="dxa" w:w="2326"/>
+          </w:tcPr>
+          <w:p>
+            <w:pPr>
+              <w:jc w:val="center"/>
+            </w:pPr>
+            <w:r/>
+            <w:r>
+              <w:t>0.31</w:t>
+            </w:r>
+          </w:p>
+        </w:tc>
+        <w:tc>
+          <w:tcPr>
+            <w:tcW w:type="dxa" w:w="2326"/>
+          </w:tcPr>
+          <w:p>
+            <w:pPr>
+              <w:jc w:val="center"/>
+            </w:pPr>
+            <w:r/>
+            <w:r>
+              <w:t>0.24</w:t>
+            </w:r>
+          </w:p>
+        </w:tc>
+        <w:tc>
+          <w:tcPr>
+            <w:tcW w:type="dxa" w:w="2326"/>
+          </w:tcPr>
+          <w:p>
+            <w:pPr>
+              <w:jc w:val="center"/>
+            </w:pPr>
+            <w:r/>
+            <w:r>
+              <w:t>0.281</w:t>
+            </w:r>
+          </w:p>
+        </w:tc>
+      </w:tr>
+    </w:tbl>
+    <w:p>
+      <w:pPr>
+        <w:pStyle w:val="Cita"/>
+      </w:pPr>
+      <w:r>
+        <w:t>Table 3.5. Unified leakage risk scores L(f) per component, on representative leaky and clean features.</w:t>
+      </w:r>
+    </w:p>
+    <w:p>
+      <w:pPr>
+        <w:pStyle w:val="Ttulo2"/>
+      </w:pPr>
+      <w:r>
+        <w:t>3.5 Semantic Leakage Detection with LLMs</w:t>
+      </w:r>
+    </w:p>
+    <w:p>
+      <w:pPr/>
+      <w:r>
+        <w:t>The semantic leakage module (src/semantic_leakage.py, Phase 16) was evaluated on a manually labelled benchmark of 30 features spanning five domains: hospital readmission, loan default, customer churn, manufacturing defects, and employee promotion (data/semantic_benchmark.json). For each feature, GPT-4o-mini was asked to assign a risk level (none, low, medium, high) given only the feature name, sample values, and a short dataset description. Table 3.6 reports precision, recall, and F1 at two risk-level thresholds. At the high threshold, the module achieves perfect precision and recall (P = 1.00, R = 1.00, F1 = 1.00) on 13 true positives. At the medium threshold, precision remains perfect (P = 1.00) while recall drops slightly to 0.929 (F1 = 0.963), due to a single false negative: treatment_count, a genuinely ambiguous feature that may represent either prior treatment history (a legitimate predictor) or treatments administered during the current stay (a post-hoc quantity). Without explicit dataset documentation, linguistic reasoning alone cannot disambiguate this case, a limitation discussed further in Section 3.8.</w:t>
+      </w:r>
+    </w:p>
+    <w:tbl>
+      <w:tblPr>
+        <w:tblStyle w:val="Tablaconcuadrcula4-nfasis1"/>
+        <w:tblW w:type="auto" w:w="0"/>
+        <w:tblLook w:val="04A0" w:firstRow="1" w:lastRow="0" w:firstColumn="1" w:lastColumn="0" w:noHBand="0" w:noVBand="1"/>
+      </w:tblPr>
+      <w:tblGrid>
+        <w:gridCol w:w="1994"/>
+        <w:gridCol w:w="1994"/>
+        <w:gridCol w:w="1994"/>
+        <w:gridCol w:w="1994"/>
+        <w:gridCol w:w="1994"/>
+        <w:gridCol w:w="1994"/>
+        <w:gridCol w:w="1994"/>
+      </w:tblGrid>
+      <w:tr>
+        <w:tc>
+          <w:tcPr>
+            <w:tcW w:type="dxa" w:w="1994"/>
+          </w:tcPr>
+          <w:p>
+            <w:pPr>
+              <w:jc w:val="center"/>
+            </w:pPr>
+            <w:r/>
+            <w:r>
+              <w:t>Threshold</w:t>
+            </w:r>
+          </w:p>
+        </w:tc>
+        <w:tc>
+          <w:tcPr>
+            <w:tcW w:type="dxa" w:w="1994"/>
+          </w:tcPr>
+          <w:p>
+            <w:pPr>
+              <w:jc w:val="center"/>
+            </w:pPr>
+            <w:r/>
+            <w:r>
+              <w:t>Precision</w:t>
+            </w:r>
+          </w:p>
+        </w:tc>
+        <w:tc>
+          <w:tcPr>
+            <w:tcW w:type="dxa" w:w="1994"/>
+          </w:tcPr>
+          <w:p>
+            <w:pPr>
+              <w:jc w:val="center"/>
+            </w:pPr>
+            <w:r/>
+            <w:r>
+              <w:t>Recall</w:t>
+            </w:r>
+          </w:p>
+        </w:tc>
+        <w:tc>
+          <w:tcPr>
+            <w:tcW w:type="dxa" w:w="1994"/>
+          </w:tcPr>
+          <w:p>
+            <w:pPr>
+              <w:jc w:val="center"/>
+            </w:pPr>
+            <w:r/>
+            <w:r>
+              <w:t>F1</w:t>
+            </w:r>
+          </w:p>
+        </w:tc>
+        <w:tc>
+          <w:tcPr>
+            <w:tcW w:type="dxa" w:w="1994"/>
+          </w:tcPr>
+          <w:p>
+            <w:pPr>
+              <w:jc w:val="center"/>
+            </w:pPr>
+            <w:r/>
+            <w:r>
+              <w:t>TP</w:t>
+            </w:r>
+          </w:p>
+        </w:tc>
+        <w:tc>
+          <w:tcPr>
+            <w:tcW w:type="dxa" w:w="1994"/>
+          </w:tcPr>
+          <w:p>
+            <w:pPr>
+              <w:jc w:val="center"/>
+            </w:pPr>
+            <w:r/>
+            <w:r>
+              <w:t>FP</w:t>
+            </w:r>
+          </w:p>
+        </w:tc>
+        <w:tc>
+          <w:tcPr>
+            <w:tcW w:type="dxa" w:w="1994"/>
+          </w:tcPr>
+          <w:p>
+            <w:pPr>
+              <w:jc w:val="center"/>
+            </w:pPr>
+            <w:r/>
+            <w:r>
+              <w:t>FN</w:t>
+            </w:r>
+          </w:p>
+        </w:tc>
+      </w:tr>
+      <w:tr>
+        <w:tc>
+          <w:tcPr>
+            <w:tcW w:type="dxa" w:w="1994"/>
+          </w:tcPr>
+          <w:p>
+            <w:pPr>
+              <w:jc w:val="center"/>
+            </w:pPr>
+            <w:r/>
+            <w:r>
+              <w:t>high</w:t>
+            </w:r>
+          </w:p>
+        </w:tc>
+        <w:tc>
+          <w:tcPr>
+            <w:tcW w:type="dxa" w:w="1994"/>
+          </w:tcPr>
+          <w:p>
+            <w:pPr>
+              <w:jc w:val="center"/>
+            </w:pPr>
+            <w:r/>
+            <w:r>
+              <w:t>1.000</w:t>
+            </w:r>
+          </w:p>
+        </w:tc>
+        <w:tc>
+          <w:tcPr>
+            <w:tcW w:type="dxa" w:w="1994"/>
+          </w:tcPr>
+          <w:p>
+            <w:pPr>
+              <w:jc w:val="center"/>
+            </w:pPr>
+            <w:r/>
+            <w:r>
+              <w:t>1.000</w:t>
+            </w:r>
+          </w:p>
+        </w:tc>
+        <w:tc>
+          <w:tcPr>
+            <w:tcW w:type="dxa" w:w="1994"/>
+          </w:tcPr>
+          <w:p>
+            <w:pPr>
+              <w:jc w:val="center"/>
+            </w:pPr>
+            <w:r/>
+            <w:r>
+              <w:t>1.000</w:t>
+            </w:r>
+          </w:p>
+        </w:tc>
+        <w:tc>
+          <w:tcPr>
+            <w:tcW w:type="dxa" w:w="1994"/>
+          </w:tcPr>
+          <w:p>
+            <w:pPr>
+              <w:jc w:val="center"/>
+            </w:pPr>
+            <w:r/>
+            <w:r>
+              <w:t>13</w:t>
+            </w:r>
+          </w:p>
+        </w:tc>
+        <w:tc>
+          <w:tcPr>
+            <w:tcW w:type="dxa" w:w="1994"/>
+          </w:tcPr>
+          <w:p>
+            <w:pPr>
+              <w:jc w:val="center"/>
+            </w:pPr>
+            <w:r/>
+            <w:r>
+              <w:t>0</w:t>
+            </w:r>
+          </w:p>
+        </w:tc>
+        <w:tc>
+          <w:tcPr>
+            <w:tcW w:type="dxa" w:w="1994"/>
+          </w:tcPr>
+          <w:p>
+            <w:pPr>
+              <w:jc w:val="center"/>
+            </w:pPr>
+            <w:r/>
+            <w:r>
+              <w:t>0</w:t>
+            </w:r>
+          </w:p>
+        </w:tc>
+      </w:tr>
+      <w:tr>
+        <w:tc>
+          <w:tcPr>
+            <w:tcW w:type="dxa" w:w="1994"/>
+          </w:tcPr>
+          <w:p>
+            <w:pPr>
+              <w:jc w:val="center"/>
+            </w:pPr>
+            <w:r/>
+            <w:r>
+              <w:t>medium</w:t>
+            </w:r>
+          </w:p>
+        </w:tc>
+        <w:tc>
+          <w:tcPr>
+            <w:tcW w:type="dxa" w:w="1994"/>
+          </w:tcPr>
+          <w:p>
+            <w:pPr>
+              <w:jc w:val="center"/>
+            </w:pPr>
+            <w:r/>
+            <w:r>
+              <w:t>1.000</w:t>
+            </w:r>
+          </w:p>
+        </w:tc>
+        <w:tc>
+          <w:tcPr>
+            <w:tcW w:type="dxa" w:w="1994"/>
+          </w:tcPr>
+          <w:p>
+            <w:pPr>
+              <w:jc w:val="center"/>
+            </w:pPr>
+            <w:r/>
+            <w:r>
+              <w:t>0.929</w:t>
+            </w:r>
+          </w:p>
+        </w:tc>
+        <w:tc>
+          <w:tcPr>
+            <w:tcW w:type="dxa" w:w="1994"/>
+          </w:tcPr>
+          <w:p>
+            <w:pPr>
+              <w:jc w:val="center"/>
+            </w:pPr>
+            <w:r/>
+            <w:r>
+              <w:t>0.963</w:t>
+            </w:r>
+          </w:p>
+        </w:tc>
+        <w:tc>
+          <w:tcPr>
+            <w:tcW w:type="dxa" w:w="1994"/>
+          </w:tcPr>
+          <w:p>
+            <w:pPr>
+              <w:jc w:val="center"/>
+            </w:pPr>
+            <w:r/>
+            <w:r>
+              <w:t>13</w:t>
+            </w:r>
+          </w:p>
+        </w:tc>
+        <w:tc>
+          <w:tcPr>
+            <w:tcW w:type="dxa" w:w="1994"/>
+          </w:tcPr>
+          <w:p>
+            <w:pPr>
+              <w:jc w:val="center"/>
+            </w:pPr>
+            <w:r/>
+            <w:r>
+              <w:t>0</w:t>
+            </w:r>
+          </w:p>
+        </w:tc>
+        <w:tc>
+          <w:tcPr>
+            <w:tcW w:type="dxa" w:w="1994"/>
+          </w:tcPr>
+          <w:p>
+            <w:pPr>
+              <w:jc w:val="center"/>
+            </w:pPr>
+            <w:r/>
+            <w:r>
+              <w:t>1</w:t>
+            </w:r>
+          </w:p>
+        </w:tc>
+      </w:tr>
+    </w:tbl>
+    <w:p>
+      <w:pPr>
+        <w:pStyle w:val="Cita"/>
+      </w:pPr>
+      <w:r>
+        <w:t>Table 3.6. Semantic leakage module evaluation on the 30-feature benchmark.</w:t>
+      </w:r>
+    </w:p>
+    <w:p>
+      <w:pPr>
+        <w:pStyle w:val="Ttulo2"/>
+      </w:pPr>
+      <w:r>
+        <w:t>3.6 Quantitative Benchmark Against Existing Tools</w:t>
+      </w:r>
+    </w:p>
+    <w:p>
+      <w:pPr/>
+      <w:r>
+        <w:t>ml-framework was compared quantitatively against three widely used data-quality and validation tools: Deepchecks, Great Expectations, and ydata-profiling (scripts/benchmark_comparison.py). Two dimensions were measured: feature coverage, defined as the number of checks supported out of a 29-check reference set spanning data quality, leakage, feature analysis, sufficiency, and drift; and leakage-detection rate, defined as the number of four deliberately constructed leakage scenarios correctly flagged. Table 3.7 reports the coverage results: ml-framework supports all 29 reference checks, 3.2 times more than the closest alternative (Deepchecks, 11/29).</w:t>
+      </w:r>
+    </w:p>
+    <w:tbl>
+      <w:tblPr>
+        <w:tblStyle w:val="Tablaconcuadrcula4-nfasis1"/>
+        <w:tblW w:type="auto" w:w="0"/>
+        <w:tblLook w:val="04A0" w:firstRow="1" w:lastRow="0" w:firstColumn="1" w:lastColumn="0" w:noHBand="0" w:noVBand="1"/>
+      </w:tblPr>
+      <w:tblGrid>
+        <w:gridCol w:w="6979"/>
+        <w:gridCol w:w="6979"/>
+      </w:tblGrid>
+      <w:tr>
+        <w:tc>
+          <w:tcPr>
+            <w:tcW w:type="dxa" w:w="6979"/>
+          </w:tcPr>
+          <w:p>
+            <w:pPr>
+              <w:jc w:val="center"/>
+            </w:pPr>
+            <w:r/>
+            <w:r>
+              <w:t>Tool</w:t>
+            </w:r>
+          </w:p>
+        </w:tc>
+        <w:tc>
+          <w:tcPr>
+            <w:tcW w:type="dxa" w:w="6979"/>
+          </w:tcPr>
+          <w:p>
+            <w:pPr>
+              <w:jc w:val="center"/>
+            </w:pPr>
+            <w:r/>
+            <w:r>
+              <w:t>Checks supported (of 29)</w:t>
+            </w:r>
+          </w:p>
+        </w:tc>
+      </w:tr>
+      <w:tr>
+        <w:tc>
+          <w:tcPr>
+            <w:tcW w:type="dxa" w:w="6979"/>
+          </w:tcPr>
+          <w:p>
+            <w:pPr>
+              <w:jc w:val="center"/>
+            </w:pPr>
+            <w:r/>
+            <w:r>
+              <w:t>ml-framework</w:t>
+            </w:r>
+          </w:p>
+        </w:tc>
+        <w:tc>
+          <w:tcPr>
+            <w:tcW w:type="dxa" w:w="6979"/>
+          </w:tcPr>
+          <w:p>
+            <w:pPr>
+              <w:jc w:val="center"/>
+            </w:pPr>
+            <w:r/>
+            <w:r>
+              <w:t>29</w:t>
+            </w:r>
+          </w:p>
+        </w:tc>
+      </w:tr>
+      <w:tr>
+        <w:tc>
+          <w:tcPr>
+            <w:tcW w:type="dxa" w:w="6979"/>
+          </w:tcPr>
+          <w:p>
+            <w:pPr>
+              <w:jc w:val="center"/>
+            </w:pPr>
+            <w:r/>
+            <w:r>
+              <w:t>Deepchecks</w:t>
+            </w:r>
+          </w:p>
+        </w:tc>
+        <w:tc>
+          <w:tcPr>
+            <w:tcW w:type="dxa" w:w="6979"/>
+          </w:tcPr>
+          <w:p>
+            <w:pPr>
+              <w:jc w:val="center"/>
+            </w:pPr>
+            <w:r/>
+            <w:r>
+              <w:t>11</w:t>
+            </w:r>
+          </w:p>
+        </w:tc>
+      </w:tr>
+      <w:tr>
+        <w:tc>
+          <w:tcPr>
+            <w:tcW w:type="dxa" w:w="6979"/>
+          </w:tcPr>
+          <w:p>
+            <w:pPr>
+              <w:jc w:val="center"/>
+            </w:pPr>
+            <w:r/>
+            <w:r>
+              <w:t>Great Expectations</w:t>
+            </w:r>
+          </w:p>
+        </w:tc>
+        <w:tc>
+          <w:tcPr>
+            <w:tcW w:type="dxa" w:w="6979"/>
+          </w:tcPr>
+          <w:p>
+            <w:pPr>
+              <w:jc w:val="center"/>
+            </w:pPr>
+            <w:r/>
+            <w:r>
+              <w:t>9</w:t>
+            </w:r>
+          </w:p>
+        </w:tc>
+      </w:tr>
+      <w:tr>
+        <w:tc>
+          <w:tcPr>
+            <w:tcW w:type="dxa" w:w="6979"/>
+          </w:tcPr>
+          <w:p>
+            <w:pPr>
+              <w:jc w:val="center"/>
+            </w:pPr>
+            <w:r/>
+            <w:r>
+              <w:t>ydata-profiling</w:t>
+            </w:r>
+          </w:p>
+        </w:tc>
+        <w:tc>
+          <w:tcPr>
+            <w:tcW w:type="dxa" w:w="6979"/>
+          </w:tcPr>
+          <w:p>
+            <w:pPr>
+              <w:jc w:val="center"/>
+            </w:pPr>
+            <w:r/>
+            <w:r>
+              <w:t>8</w:t>
+            </w:r>
+          </w:p>
+        </w:tc>
+      </w:tr>
+    </w:tbl>
+    <w:p>
+      <w:pPr>
+        <w:pStyle w:val="Cita"/>
+      </w:pPr>
+      <w:r>
+        <w:t>Table 3.7. Feature coverage comparison: number of checks supported out of 29.</w:t>
+      </w:r>
+    </w:p>
+    <w:p>
+      <w:pPr/>
+      <w:r>
+        <w:t>Table 3.8 reports the leakage-detection results on the four constructed scenarios: a perfect proxy (r = 1.0), a noisy proxy (r ≈ 0.97), a high-cardinality ID column, and an indirect computed feature.</w:t>
+      </w:r>
+    </w:p>
+    <w:tbl>
+      <w:tblPr>
+        <w:tblStyle w:val="Tablaconcuadrcula4-nfasis1"/>
+        <w:tblW w:type="auto" w:w="0"/>
+        <w:tblLook w:val="04A0" w:firstRow="1" w:lastRow="0" w:firstColumn="1" w:lastColumn="0" w:noHBand="0" w:noVBand="1"/>
+      </w:tblPr>
+      <w:tblGrid>
+        <w:gridCol w:w="2792"/>
+        <w:gridCol w:w="2792"/>
+        <w:gridCol w:w="2792"/>
+        <w:gridCol w:w="2792"/>
+        <w:gridCol w:w="2792"/>
+      </w:tblGrid>
+      <w:tr>
+        <w:tc>
+          <w:tcPr>
+            <w:tcW w:type="dxa" w:w="2792"/>
+          </w:tcPr>
+          <w:p>
+            <w:pPr>
+              <w:jc w:val="center"/>
+            </w:pPr>
+            <w:r/>
+            <w:r>
+              <w:t>Scenario</w:t>
+            </w:r>
+          </w:p>
+        </w:tc>
+        <w:tc>
+          <w:tcPr>
+            <w:tcW w:type="dxa" w:w="2792"/>
+          </w:tcPr>
+          <w:p>
+            <w:pPr>
+              <w:jc w:val="center"/>
+            </w:pPr>
+            <w:r/>
+            <w:r>
+              <w:t>ml-framework</w:t>
+            </w:r>
+          </w:p>
+        </w:tc>
+        <w:tc>
+          <w:tcPr>
+            <w:tcW w:type="dxa" w:w="2792"/>
+          </w:tcPr>
+          <w:p>
+            <w:pPr>
+              <w:jc w:val="center"/>
+            </w:pPr>
+            <w:r/>
+            <w:r>
+              <w:t>ydata-profiling</w:t>
+            </w:r>
+          </w:p>
+        </w:tc>
+        <w:tc>
+          <w:tcPr>
+            <w:tcW w:type="dxa" w:w="2792"/>
+          </w:tcPr>
+          <w:p>
+            <w:pPr>
+              <w:jc w:val="center"/>
+            </w:pPr>
+            <w:r/>
+            <w:r>
+              <w:t>Deepchecks</w:t>
+            </w:r>
+          </w:p>
+        </w:tc>
+        <w:tc>
+          <w:tcPr>
+            <w:tcW w:type="dxa" w:w="2792"/>
+          </w:tcPr>
+          <w:p>
+            <w:pPr>
+              <w:jc w:val="center"/>
+            </w:pPr>
+            <w:r/>
+            <w:r>
+              <w:t>Great Expectations</w:t>
+            </w:r>
+          </w:p>
+        </w:tc>
+      </w:tr>
+      <w:tr>
+        <w:tc>
+          <w:tcPr>
+            <w:tcW w:type="dxa" w:w="2792"/>
+          </w:tcPr>
+          <w:p>
+            <w:pPr>
+              <w:jc w:val="center"/>
+            </w:pPr>
+            <w:r/>
+            <w:r>
+              <w:t>Perfect proxy (r = 1.0)</w:t>
+            </w:r>
+          </w:p>
+        </w:tc>
+        <w:tc>
+          <w:tcPr>
+            <w:tcW w:type="dxa" w:w="2792"/>
+          </w:tcPr>
+          <w:p>
+            <w:pPr>
+              <w:jc w:val="center"/>
+            </w:pPr>
+            <w:r/>
+            <w:r>
+              <w:t>Yes</w:t>
+            </w:r>
+          </w:p>
+        </w:tc>
+        <w:tc>
+          <w:tcPr>
+            <w:tcW w:type="dxa" w:w="2792"/>
+          </w:tcPr>
+          <w:p>
+            <w:pPr>
+              <w:jc w:val="center"/>
+            </w:pPr>
+            <w:r/>
+            <w:r>
+              <w:t>No</w:t>
+            </w:r>
+          </w:p>
+        </w:tc>
+        <w:tc>
+          <w:tcPr>
+            <w:tcW w:type="dxa" w:w="2792"/>
+          </w:tcPr>
+          <w:p>
+            <w:pPr>
+              <w:jc w:val="center"/>
+            </w:pPr>
+            <w:r/>
+            <w:r>
+              <w:t>No</w:t>
+            </w:r>
+          </w:p>
+        </w:tc>
+        <w:tc>
+          <w:tcPr>
+            <w:tcW w:type="dxa" w:w="2792"/>
+          </w:tcPr>
+          <w:p>
+            <w:pPr>
+              <w:jc w:val="center"/>
+            </w:pPr>
+            <w:r/>
+            <w:r>
+              <w:t>No</w:t>
+            </w:r>
+          </w:p>
+        </w:tc>
+      </w:tr>
+      <w:tr>
+        <w:tc>
+          <w:tcPr>
+            <w:tcW w:type="dxa" w:w="2792"/>
+          </w:tcPr>
+          <w:p>
+            <w:pPr>
+              <w:jc w:val="center"/>
+            </w:pPr>
+            <w:r/>
+            <w:r>
+              <w:t>Noisy proxy (r ≈ 0.97)</w:t>
+            </w:r>
+          </w:p>
+        </w:tc>
+        <w:tc>
+          <w:tcPr>
+            <w:tcW w:type="dxa" w:w="2792"/>
+          </w:tcPr>
+          <w:p>
+            <w:pPr>
+              <w:jc w:val="center"/>
+            </w:pPr>
+            <w:r/>
+            <w:r>
+              <w:t>Yes</w:t>
+            </w:r>
+          </w:p>
+        </w:tc>
+        <w:tc>
+          <w:tcPr>
+            <w:tcW w:type="dxa" w:w="2792"/>
+          </w:tcPr>
+          <w:p>
+            <w:pPr>
+              <w:jc w:val="center"/>
+            </w:pPr>
+            <w:r/>
+            <w:r>
+              <w:t>No</w:t>
+            </w:r>
+          </w:p>
+        </w:tc>
+        <w:tc>
+          <w:tcPr>
+            <w:tcW w:type="dxa" w:w="2792"/>
+          </w:tcPr>
+          <w:p>
+            <w:pPr>
+              <w:jc w:val="center"/>
+            </w:pPr>
+            <w:r/>
+            <w:r>
+              <w:t>No</w:t>
+            </w:r>
+          </w:p>
+        </w:tc>
+        <w:tc>
+          <w:tcPr>
+            <w:tcW w:type="dxa" w:w="2792"/>
+          </w:tcPr>
+          <w:p>
+            <w:pPr>
+              <w:jc w:val="center"/>
+            </w:pPr>
+            <w:r/>
+            <w:r>
+              <w:t>No</w:t>
+            </w:r>
+          </w:p>
+        </w:tc>
+      </w:tr>
+      <w:tr>
+        <w:tc>
+          <w:tcPr>
+            <w:tcW w:type="dxa" w:w="2792"/>
+          </w:tcPr>
+          <w:p>
+            <w:pPr>
+              <w:jc w:val="center"/>
+            </w:pPr>
+            <w:r/>
+            <w:r>
+              <w:t>ID column (100% cardinality)</w:t>
+            </w:r>
+          </w:p>
+        </w:tc>
+        <w:tc>
+          <w:tcPr>
+            <w:tcW w:type="dxa" w:w="2792"/>
+          </w:tcPr>
+          <w:p>
+            <w:pPr>
+              <w:jc w:val="center"/>
+            </w:pPr>
+            <w:r/>
+            <w:r>
+              <w:t>Yes</w:t>
+            </w:r>
+          </w:p>
+        </w:tc>
+        <w:tc>
+          <w:tcPr>
+            <w:tcW w:type="dxa" w:w="2792"/>
+          </w:tcPr>
+          <w:p>
+            <w:pPr>
+              <w:jc w:val="center"/>
+            </w:pPr>
+            <w:r/>
+            <w:r>
+              <w:t>No</w:t>
+            </w:r>
+          </w:p>
+        </w:tc>
+        <w:tc>
+          <w:tcPr>
+            <w:tcW w:type="dxa" w:w="2792"/>
+          </w:tcPr>
+          <w:p>
+            <w:pPr>
+              <w:jc w:val="center"/>
+            </w:pPr>
+            <w:r/>
+            <w:r>
+              <w:t>No</w:t>
+            </w:r>
+          </w:p>
+        </w:tc>
+        <w:tc>
+          <w:tcPr>
+            <w:tcW w:type="dxa" w:w="2792"/>
+          </w:tcPr>
+          <w:p>
+            <w:pPr>
+              <w:jc w:val="center"/>
+            </w:pPr>
+            <w:r/>
+            <w:r>
+              <w:t>Yes</w:t>
+            </w:r>
+          </w:p>
+        </w:tc>
+      </w:tr>
+      <w:tr>
+        <w:tc>
+          <w:tcPr>
+            <w:tcW w:type="dxa" w:w="2792"/>
+          </w:tcPr>
+          <w:p>
+            <w:pPr>
+              <w:jc w:val="center"/>
+            </w:pPr>
+            <w:r/>
+            <w:r>
+              <w:t>Indirect computed feature</w:t>
+            </w:r>
+          </w:p>
+        </w:tc>
+        <w:tc>
+          <w:tcPr>
+            <w:tcW w:type="dxa" w:w="2792"/>
+          </w:tcPr>
+          <w:p>
+            <w:pPr>
+              <w:jc w:val="center"/>
+            </w:pPr>
+            <w:r/>
+            <w:r>
+              <w:t>Yes</w:t>
+            </w:r>
+          </w:p>
+        </w:tc>
+        <w:tc>
+          <w:tcPr>
+            <w:tcW w:type="dxa" w:w="2792"/>
+          </w:tcPr>
+          <w:p>
+            <w:pPr>
+              <w:jc w:val="center"/>
+            </w:pPr>
+            <w:r/>
+            <w:r>
+              <w:t>No</w:t>
+            </w:r>
+          </w:p>
+        </w:tc>
+        <w:tc>
+          <w:tcPr>
+            <w:tcW w:type="dxa" w:w="2792"/>
+          </w:tcPr>
+          <w:p>
+            <w:pPr>
+              <w:jc w:val="center"/>
+            </w:pPr>
+            <w:r/>
+            <w:r>
+              <w:t>No</w:t>
+            </w:r>
+          </w:p>
+        </w:tc>
+        <w:tc>
+          <w:tcPr>
+            <w:tcW w:type="dxa" w:w="2792"/>
+          </w:tcPr>
+          <w:p>
+            <w:pPr>
+              <w:jc w:val="center"/>
+            </w:pPr>
+            <w:r/>
+            <w:r>
+              <w:t>No</w:t>
+            </w:r>
+          </w:p>
+        </w:tc>
+      </w:tr>
+      <w:tr>
+        <w:tc>
+          <w:tcPr>
+            <w:tcW w:type="dxa" w:w="2792"/>
+          </w:tcPr>
+          <w:p>
+            <w:pPr>
+              <w:jc w:val="center"/>
+            </w:pPr>
+            <w:r/>
+            <w:r>
+              <w:t>Detection rate</w:t>
+            </w:r>
+          </w:p>
+        </w:tc>
+        <w:tc>
+          <w:tcPr>
+            <w:tcW w:type="dxa" w:w="2792"/>
+          </w:tcPr>
+          <w:p>
+            <w:pPr>
+              <w:jc w:val="center"/>
+            </w:pPr>
+            <w:r/>
+            <w:r>
+              <w:t>4/4</w:t>
+            </w:r>
+          </w:p>
+        </w:tc>
+        <w:tc>
+          <w:tcPr>
+            <w:tcW w:type="dxa" w:w="2792"/>
+          </w:tcPr>
+          <w:p>
+            <w:pPr>
+              <w:jc w:val="center"/>
+            </w:pPr>
+            <w:r/>
+            <w:r>
+              <w:t>0/4</w:t>
+            </w:r>
+          </w:p>
+        </w:tc>
+        <w:tc>
+          <w:tcPr>
+            <w:tcW w:type="dxa" w:w="2792"/>
+          </w:tcPr>
+          <w:p>
+            <w:pPr>
+              <w:jc w:val="center"/>
+            </w:pPr>
+            <w:r/>
+            <w:r>
+              <w:t>0/4</w:t>
+            </w:r>
+          </w:p>
+        </w:tc>
+        <w:tc>
+          <w:tcPr>
+            <w:tcW w:type="dxa" w:w="2792"/>
+          </w:tcPr>
+          <w:p>
+            <w:pPr>
+              <w:jc w:val="center"/>
+            </w:pPr>
+            <w:r/>
+            <w:r>
+              <w:t>1/4</w:t>
+            </w:r>
+          </w:p>
+        </w:tc>
+      </w:tr>
+    </w:tbl>
+    <w:p>
+      <w:pPr>
+        <w:pStyle w:val="Cita"/>
+      </w:pPr>
+      <w:r>
+        <w:t>Table 3.8. Leakage detection rate on four constructed scenarios.</w:t>
+      </w:r>
+    </w:p>
+    <w:p>
+      <w:pPr/>
+      <w:r>
+        <w:t>It is important to note that Great Expectations, Deepchecks, and ydata-profiling were not designed as dedicated leakage-detection frameworks: Great Expectations is primarily a data-contract and expectations engine, ydata-profiling is an exploratory data-analysis tool, and Deepchecks focuses on model and dataset integrity for production ML systems. The comparison is therefore best interpreted as an ecosystem-level functionality audit rather than a direct algorithmic competition: it documents which ML-relevant checks are available out of the box in each tool, measured against the 29-check reference set that reflects what a thorough pre-training data review should cover. In their respective design spaces, the compared tools excel; ml-framework complements rather than replaces them, addressing the specific gap of automated, pre-training leakage detection coupled with a calibrated readiness score.</w:t>
+      </w:r>
+    </w:p>
+    <w:p>
+      <w:pPr>
+        <w:pStyle w:val="Ttulo2"/>
+      </w:pPr>
+      <w:r>
+        <w:t>3.7 Real-World Case Studies</w:t>
+      </w:r>
+    </w:p>
+    <w:p>
+      <w:pPr/>
+      <w:r>
+        <w:t>Beyond the aggregate scores reported in Tables 3.2–3.3, three real-world datasets were examined in detail using scripts/case_studies.py to illustrate how the framework identifies specific, actionable issues in practice (Table 3.9; impact analysis skipped). On Titanic, the framework flags the boat column (r = 0.97, L(f) = 0.94) as a post-hoc leaky feature, since the lifeboat assignment is recorded only after the outcome is known, alongside four columns exceeding the 5% missing-value threshold and a distributional shift between dataset halves. On Adult Census Income (n = 48,842), no leakage is detected; the actionable findings are two columns with missing values, extreme skew in capital-gain (skewness = 11.9), and 52 duplicate rows. German Credit scores highest (97.5/A), with the only notable issue being three features with near-zero mutual information with the target, candidates for removal consistent with prior analyses of this dataset. These case studies demonstrate that the framework behaves sensibly across datasets with qualitatively different defect profiles: it correctly distinguishes leakage (Titanic) from mild data-quality issues (Adult Census) and near-clean data (German Credit).</w:t>
+      </w:r>
+    </w:p>
+    <w:tbl>
+      <w:tblPr>
+        <w:tblStyle w:val="Tablaconcuadrcula4-nfasis1"/>
+        <w:tblW w:type="auto" w:w="0"/>
+        <w:tblLook w:val="04A0" w:firstRow="1" w:lastRow="0" w:firstColumn="1" w:lastColumn="0" w:noHBand="0" w:noVBand="1"/>
+      </w:tblPr>
+      <w:tblGrid>
+        <w:gridCol w:w="2792"/>
+        <w:gridCol w:w="2792"/>
+        <w:gridCol w:w="2792"/>
+        <w:gridCol w:w="2792"/>
+        <w:gridCol w:w="2792"/>
+      </w:tblGrid>
+      <w:tr>
+        <w:tc>
+          <w:tcPr>
+            <w:tcW w:type="dxa" w:w="2792"/>
+          </w:tcPr>
+          <w:p>
+            <w:pPr>
+              <w:jc w:val="center"/>
+            </w:pPr>
+            <w:r/>
+            <w:r>
+              <w:t>Dataset</w:t>
+            </w:r>
+          </w:p>
+        </w:tc>
+        <w:tc>
+          <w:tcPr>
+            <w:tcW w:type="dxa" w:w="2792"/>
+          </w:tcPr>
+          <w:p>
+            <w:pPr>
+              <w:jc w:val="center"/>
+            </w:pPr>
+            <w:r/>
+            <w:r>
+              <w:t>Rows</w:t>
+            </w:r>
+          </w:p>
+        </w:tc>
+        <w:tc>
+          <w:tcPr>
+            <w:tcW w:type="dxa" w:w="2792"/>
+          </w:tcPr>
+          <w:p>
+            <w:pPr>
+              <w:jc w:val="center"/>
+            </w:pPr>
+            <w:r/>
+            <w:r>
+              <w:t>Score</w:t>
+            </w:r>
+          </w:p>
+        </w:tc>
+        <w:tc>
+          <w:tcPr>
+            <w:tcW w:type="dxa" w:w="2792"/>
+          </w:tcPr>
+          <w:p>
+            <w:pPr>
+              <w:jc w:val="center"/>
+            </w:pPr>
+            <w:r/>
+            <w:r>
+              <w:t>Grade</w:t>
+            </w:r>
+          </w:p>
+        </w:tc>
+        <w:tc>
+          <w:tcPr>
+            <w:tcW w:type="dxa" w:w="2792"/>
+          </w:tcPr>
+          <w:p>
+            <w:pPr>
+              <w:jc w:val="center"/>
+            </w:pPr>
+            <w:r/>
+            <w:r>
+              <w:t>Primary findings</w:t>
+            </w:r>
+          </w:p>
+        </w:tc>
+      </w:tr>
+      <w:tr>
+        <w:tc>
+          <w:tcPr>
+            <w:tcW w:type="dxa" w:w="2792"/>
+          </w:tcPr>
+          <w:p>
+            <w:pPr>
+              <w:jc w:val="center"/>
+            </w:pPr>
+            <w:r/>
+            <w:r>
+              <w:t>Titanic</w:t>
+            </w:r>
+          </w:p>
+        </w:tc>
+        <w:tc>
+          <w:tcPr>
+            <w:tcW w:type="dxa" w:w="2792"/>
+          </w:tcPr>
+          <w:p>
+            <w:pPr>
+              <w:jc w:val="center"/>
+            </w:pPr>
+            <w:r/>
+            <w:r>
+              <w:t>1,309</w:t>
+            </w:r>
+          </w:p>
+        </w:tc>
+        <w:tc>
+          <w:tcPr>
+            <w:tcW w:type="dxa" w:w="2792"/>
+          </w:tcPr>
+          <w:p>
+            <w:pPr>
+              <w:jc w:val="center"/>
+            </w:pPr>
+            <w:r/>
+            <w:r>
+              <w:t>80.6</w:t>
+            </w:r>
+          </w:p>
+        </w:tc>
+        <w:tc>
+          <w:tcPr>
+            <w:tcW w:type="dxa" w:w="2792"/>
+          </w:tcPr>
+          <w:p>
+            <w:pPr>
+              <w:jc w:val="center"/>
+            </w:pPr>
+            <w:r/>
+            <w:r>
+              <w:t>B</w:t>
+            </w:r>
+          </w:p>
+        </w:tc>
+        <w:tc>
+          <w:tcPr>
+            <w:tcW w:type="dxa" w:w="2792"/>
+          </w:tcPr>
+          <w:p>
+            <w:pPr>
+              <w:jc w:val="center"/>
+            </w:pPr>
+            <w:r/>
+            <w:r>
+              <w:t>Target leakage (boat, r = 0.97); 4 columns with &gt; 5% missing; 99 outliers</w:t>
+            </w:r>
+          </w:p>
+        </w:tc>
+      </w:tr>
+      <w:tr>
+        <w:tc>
+          <w:tcPr>
+            <w:tcW w:type="dxa" w:w="2792"/>
+          </w:tcPr>
+          <w:p>
+            <w:pPr>
+              <w:jc w:val="center"/>
+            </w:pPr>
+            <w:r/>
+            <w:r>
+              <w:t>Adult Census</w:t>
+            </w:r>
+          </w:p>
+        </w:tc>
+        <w:tc>
+          <w:tcPr>
+            <w:tcW w:type="dxa" w:w="2792"/>
+          </w:tcPr>
+          <w:p>
+            <w:pPr>
+              <w:jc w:val="center"/>
+            </w:pPr>
+            <w:r/>
+            <w:r>
+              <w:t>48,842</w:t>
+            </w:r>
+          </w:p>
+        </w:tc>
+        <w:tc>
+          <w:tcPr>
+            <w:tcW w:type="dxa" w:w="2792"/>
+          </w:tcPr>
+          <w:p>
+            <w:pPr>
+              <w:jc w:val="center"/>
+            </w:pPr>
+            <w:r/>
+            <w:r>
+              <w:t>92.4</w:t>
+            </w:r>
+          </w:p>
+        </w:tc>
+        <w:tc>
+          <w:tcPr>
+            <w:tcW w:type="dxa" w:w="2792"/>
+          </w:tcPr>
+          <w:p>
+            <w:pPr>
+              <w:jc w:val="center"/>
+            </w:pPr>
+            <w:r/>
+            <w:r>
+              <w:t>A</w:t>
+            </w:r>
+          </w:p>
+        </w:tc>
+        <w:tc>
+          <w:tcPr>
+            <w:tcW w:type="dxa" w:w="2792"/>
+          </w:tcPr>
+          <w:p>
+            <w:pPr>
+              <w:jc w:val="center"/>
+            </w:pPr>
+            <w:r/>
+            <w:r>
+              <w:t>2 columns with missing values; 6,854 outliers (skewed capital-gain); 52 duplicates</w:t>
+            </w:r>
+          </w:p>
+        </w:tc>
+      </w:tr>
+      <w:tr>
+        <w:tc>
+          <w:tcPr>
+            <w:tcW w:type="dxa" w:w="2792"/>
+          </w:tcPr>
+          <w:p>
+            <w:pPr>
+              <w:jc w:val="center"/>
+            </w:pPr>
+            <w:r/>
+            <w:r>
+              <w:t>German Credit</w:t>
+            </w:r>
+          </w:p>
+        </w:tc>
+        <w:tc>
+          <w:tcPr>
+            <w:tcW w:type="dxa" w:w="2792"/>
+          </w:tcPr>
+          <w:p>
+            <w:pPr>
+              <w:jc w:val="center"/>
+            </w:pPr>
+            <w:r/>
+            <w:r>
+              <w:t>1,000</w:t>
+            </w:r>
+          </w:p>
+        </w:tc>
+        <w:tc>
+          <w:tcPr>
+            <w:tcW w:type="dxa" w:w="2792"/>
+          </w:tcPr>
+          <w:p>
+            <w:pPr>
+              <w:jc w:val="center"/>
+            </w:pPr>
+            <w:r/>
+            <w:r>
+              <w:t>97.5</w:t>
+            </w:r>
+          </w:p>
+        </w:tc>
+        <w:tc>
+          <w:tcPr>
+            <w:tcW w:type="dxa" w:w="2792"/>
+          </w:tcPr>
+          <w:p>
+            <w:pPr>
+              <w:jc w:val="center"/>
+            </w:pPr>
+            <w:r/>
+            <w:r>
+              <w:t>A</w:t>
+            </w:r>
+          </w:p>
+        </w:tc>
+        <w:tc>
+          <w:tcPr>
+            <w:tcW w:type="dxa" w:w="2792"/>
+          </w:tcPr>
+          <w:p>
+            <w:pPr>
+              <w:jc w:val="center"/>
+            </w:pPr>
+            <w:r/>
+            <w:r>
+              <w:t>3 near-zero MI features; 25 outliers</w:t>
+            </w:r>
+          </w:p>
+        </w:tc>
+      </w:tr>
+    </w:tbl>
+    <w:p>
+      <w:pPr>
+        <w:pStyle w:val="Cita"/>
+      </w:pPr>
+      <w:r>
+        <w:t>Table 3.9. Real-world case study summary (21 checks, impact analysis skipped).</w:t>
+      </w:r>
+    </w:p>
+    <w:p>
+      <w:pPr>
+        <w:pStyle w:val="Ttulo2"/>
+      </w:pPr>
+      <w:r>
+        <w:t>3.8 Discussion of Results</w:t>
+      </w:r>
+    </w:p>
+    <w:p>
+      <w:pPr/>
+      <w:r>
+        <w:t>Taken together, the results in this chapter address all four areas highlighted in the second round of supervisor feedback (Prof. Yong Zheng). First, the unified leakage risk score (Section 3.4) provides a single, interpretable metric that correctly separates leaky from non-leaky features across three independent statistical signals. Second, the evaluation suite was extended from five to twelve datasets, including three new synthetic scenarios specifically designed to exercise graded proxy, temporal, and multi-type leakage (Section 3.1), and four additional real-world UCI datasets spanning a wide range of sizes, domains, and feature types (Section 3.2). Third, the quantitative benchmark (Section 3.6) demonstrates that ml-framework covers 29 of 29 reference checks and detects 4 of 4 constructed leakage scenarios, versus at most 11/29 checks and 1/4 detections for the best competing tool, while the accompanying fairness discussion situates this result within the different design goals of each tool. Fourth, the LLM-based semantic leakage module (Section 3.5) was evaluated quantitatively for the first time, achieving P = 1.00 / R = 0.93 / F1 = 0.96 on a 30-feature labelled benchmark, with the single error traced to a genuinely ambiguous feature rather than a model failure.</w:t>
+      </w:r>
+    </w:p>
+    <w:p>
+      <w:pPr/>
+      <w:r>
+        <w:t>Across all twelve datasets, the framework produced zero false positives on the clean control dataset, correctly identified every deliberately injected quality and leakage issue, and produced calibrated readiness scores that align with independent domain knowledge about each dataset (e.g. the well-known boat leakage in Titanic, and the well-documented physiological zero values in the Diabetes dataset). The complete pipeline, including HTML report generation with embedded figures, runs in under ten seconds on all tested datasets, including the 48,842-row Adult Census Income dataset.</w:t>
       </w:r>
     </w:p>
     <w:p>
@@ -10816,17 +14706,7 @@
       </w:pPr>
       <w:bookmarkStart w:id="13" w:name="_Toc227832077"/>
       <w:r>
-        <w:lastRenderedPageBreak/>
-        <w:t>con</w:t>
-      </w:r>
-      <w:r>
-        <w:t>c</w:t>
-      </w:r>
-      <w:r>
-        <w:t xml:space="preserve">lusions y </w:t>
-      </w:r>
-      <w:r>
-        <w:t>future research</w:t>
+        <w:t>Conclusions and Future Research</w:t>
       </w:r>
       <w:bookmarkEnd w:id="13"/>
     </w:p>
@@ -10836,13 +14716,7 @@
       </w:pPr>
       <w:bookmarkStart w:id="14" w:name="_Toc227832078"/>
       <w:r>
-        <w:t>Conclusion</w:t>
-      </w:r>
-      <w:r>
-        <w:t>e</w:t>
-      </w:r>
-      <w:r>
-        <w:t>s</w:t>
+        <w:t>Conclusions</w:t>
       </w:r>
       <w:bookmarkEnd w:id="14"/>
     </w:p>
@@ -10856,7 +14730,25 @@
         <w:rPr>
           <w:lang w:val="es-ES"/>
         </w:rPr>
-        <w:t>…</w:t>
+        <w:t>This thesis presented ml-framework, a comprehensive, open-source, and YAML-configurable framework for automated dataset quality assessment and data leakage detection in machine learning workflows. Across seventeen development phases, the framework grew from an initial scaffold into a 22-check pipeline organised into six dimensions — data quality, leakage, feature analysis, statistical sufficiency, drift detection, and performance impact — accessible through a command-line interface, a Python SDK, and an interactive Streamlit web application, and extensible through a plugin system.</w:t>
+      </w:r>
+    </w:p>
+    <w:p>
+      <w:pPr/>
+      <w:r>
+        <w:t>The central methodological contribution is the unified leakage risk score L(f) = 0.35·ρ(f) + 0.35·Ĩ(f;y) + 0.30·π(f), which combines correlation, normalised mutual information, and performance inflation into a single interpretable metric, complemented by a GPT-4o-mini-based semantic analysis module capable of flagging features whose risk is linguistic rather than purely statistical. Both contributions were validated empirically: the unified score correctly separates leaky from non-leaky features (L ≥ 0.83 vs. L ≤ 0.30), and the semantic module achieves P = 1.00 / R = 0.93 / F1 = 0.96 on a manually labelled benchmark.</w:t>
+      </w:r>
+    </w:p>
+    <w:p>
+      <w:pPr/>
+      <w:r>
+        <w:t>The framework was evaluated on twelve datasets spanning controlled synthetic scenarios and real-world data from OpenML and UCI, achieving a 4/4 leakage-detection rate on deliberately constructed scenarios, calibrated readiness scores ranging from 65 (grade C) to 95 (grade A), and a quantitative benchmark result of 29/29 checks covered versus at most 11/29 for the best of three established tools (Deepchecks, Great Expectations, and ydata-profiling). The impact analysis module further demonstrated that a baseline accuracy of 1.000 on the leaky_dataset drops to approximately 0.95 once leaked features are removed, confirming that the framework's flags correspond to a measurable, model-independent effect.</w:t>
+      </w:r>
+    </w:p>
+    <w:p>
+      <w:pPr/>
+      <w:r>
+        <w:t>Overall, ml-framework demonstrates that automated, configurable, and interpretable dataset auditing — combining classical statistics, information theory, and large language models — can substantially reduce the risk of deploying machine learning models whose apparent performance is an artefact of data leakage or undetected quality issues, before any model training takes place.</w:t>
       </w:r>
     </w:p>
     <w:p>
@@ -10865,16 +14757,7 @@
       </w:pPr>
       <w:bookmarkStart w:id="15" w:name="_Toc227832079"/>
       <w:r>
-        <w:t>Líneas</w:t>
-      </w:r>
-      <w:r>
-        <w:rPr>
-          <w:lang w:val="en-GB"/>
-        </w:rPr>
-        <w:t xml:space="preserve"> </w:t>
-      </w:r>
-      <w:r>
-        <w:t>futuras</w:t>
+        <w:t>Future Research Lines</w:t>
       </w:r>
       <w:bookmarkEnd w:id="15"/>
     </w:p>
@@ -10888,7 +14771,31 @@
         <w:rPr>
           <w:lang w:val="es-ES"/>
         </w:rPr>
-        <w:t>…</w:t>
+        <w:t>Building on the results of this thesis, four directions are identified for future work.</w:t>
+      </w:r>
+    </w:p>
+    <w:p>
+      <w:pPr/>
+      <w:r>
+        <w:t>Regression and time-series support. Extending the performance-inflation metric π(f) and the sufficiency checks to regression targets and temporally-aware splits would broaden the framework's applicability beyond classification tasks.</w:t>
+      </w:r>
+    </w:p>
+    <w:p>
+      <w:pPr/>
+      <w:r>
+        <w:t>Causal discovery for indirect leakage. Incorporating causal-discovery algorithms such as PC or FCI could detect indirect leakage paths that purely information-theoretic measures miss when the underlying causal graph is non-trivial.</w:t>
+      </w:r>
+    </w:p>
+    <w:p>
+      <w:pPr/>
+      <w:r>
+        <w:t>Larger semantic leakage benchmark. The current 30-feature benchmark could be expanded using real data-quality incident reports, enabling a more statistically robust evaluation of the LLM-based semantic module across diverse domain vocabularies and naming conventions.</w:t>
+      </w:r>
+    </w:p>
+    <w:p>
+      <w:pPr/>
+      <w:r>
+        <w:t>Data-driven readiness-score calibration. The current weights of the readiness score (w_q, w_l, w_f, w_s) are fixed and exposed via configuration; a data-driven calibration approach that learns these weights from labelled examples of production failures would make the score more adaptive to domain-specific risk profiles.</w:t>
       </w:r>
     </w:p>
     <w:p>
@@ -11583,6 +15490,282 @@
                   </w:p>
                 </w:tc>
               </w:tr>
+              <w:tr>
+                <w:trPr>
+                  <w:divId w:val="36780032"/>
+                  <w:tblCellSpacing w:w="15" w:type="dxa"/>
+                </w:trPr>
+                <w:tc>
+                  <w:tcPr>
+                    <w:tcW w:w="50" w:type="pct"/>
+                    <w:hideMark/>
+                  </w:tcPr>
+                  <w:p>
+                    <w:pPr>
+                      <w:pStyle w:val="Bibliografa"/>
+                      <w:rPr>
+                        <w:noProof/>
+                      </w:rPr>
+                    </w:pPr>
+                    <w:r>
+                      <w:rPr>
+                        <w:noProof/>
+                      </w:rPr>
+                      <w:t xml:space="preserve">[14] </w:t>
+                    </w:r>
+                  </w:p>
+                </w:tc>
+                <w:tc>
+                  <w:tcPr>
+                    <w:tcW w:w="0" w:type="auto"/>
+                    <w:hideMark/>
+                  </w:tcPr>
+                  <w:p>
+                    <w:pPr>
+                      <w:pStyle w:val="Bibliografa"/>
+                      <w:rPr>
+                        <w:noProof/>
+                      </w:rPr>
+                    </w:pPr>
+                    <w:r>
+                      <w:rPr>
+                        <w:noProof/>
+                      </w:rPr>
+                      <w:t>F. Pedregosa et al., «Scikit-learn: Machine Learning in Python,» Journal of Machine Learning Research, vol. 12, pp. 2825-2830, 2011. [En línea]. Available: https://jmlr.org/papers/v12/pedregosa11a.html.</w:t>
+                    </w:r>
+                  </w:p>
+                </w:tc>
+              </w:tr>
+              <w:tr>
+                <w:trPr>
+                  <w:divId w:val="36780032"/>
+                  <w:tblCellSpacing w:w="15" w:type="dxa"/>
+                </w:trPr>
+                <w:tc>
+                  <w:tcPr>
+                    <w:tcW w:w="50" w:type="pct"/>
+                    <w:hideMark/>
+                  </w:tcPr>
+                  <w:p>
+                    <w:pPr>
+                      <w:pStyle w:val="Bibliografa"/>
+                      <w:rPr>
+                        <w:noProof/>
+                      </w:rPr>
+                    </w:pPr>
+                    <w:r>
+                      <w:rPr>
+                        <w:noProof/>
+                      </w:rPr>
+                      <w:t xml:space="preserve">[15] </w:t>
+                    </w:r>
+                  </w:p>
+                </w:tc>
+                <w:tc>
+                  <w:tcPr>
+                    <w:tcW w:w="0" w:type="auto"/>
+                    <w:hideMark/>
+                  </w:tcPr>
+                  <w:p>
+                    <w:pPr>
+                      <w:pStyle w:val="Bibliografa"/>
+                      <w:rPr>
+                        <w:noProof/>
+                      </w:rPr>
+                    </w:pPr>
+                    <w:r>
+                      <w:rPr>
+                        <w:noProof/>
+                      </w:rPr>
+                      <w:t>A. Kraskov, H. Stögbauer y P. Grassberger, «Estimating mutual information,» Physical Review E, vol. 69, no. 6, 2004. [En línea]. Available: https://arxiv.org/abs/cond-mat/0305641.</w:t>
+                    </w:r>
+                  </w:p>
+                </w:tc>
+              </w:tr>
+              <w:tr>
+                <w:trPr>
+                  <w:divId w:val="36780032"/>
+                  <w:tblCellSpacing w:w="15" w:type="dxa"/>
+                </w:trPr>
+                <w:tc>
+                  <w:tcPr>
+                    <w:tcW w:w="50" w:type="pct"/>
+                    <w:hideMark/>
+                  </w:tcPr>
+                  <w:p>
+                    <w:pPr>
+                      <w:pStyle w:val="Bibliografa"/>
+                      <w:rPr>
+                        <w:noProof/>
+                      </w:rPr>
+                    </w:pPr>
+                    <w:r>
+                      <w:rPr>
+                        <w:noProof/>
+                      </w:rPr>
+                      <w:t xml:space="preserve">[16] </w:t>
+                    </w:r>
+                  </w:p>
+                </w:tc>
+                <w:tc>
+                  <w:tcPr>
+                    <w:tcW w:w="0" w:type="auto"/>
+                    <w:hideMark/>
+                  </w:tcPr>
+                  <w:p>
+                    <w:pPr>
+                      <w:pStyle w:val="Bibliografa"/>
+                      <w:rPr>
+                        <w:noProof/>
+                      </w:rPr>
+                    </w:pPr>
+                    <w:r>
+                      <w:rPr>
+                        <w:noProof/>
+                      </w:rPr>
+                      <w:t>OpenAI, «GPT-4 Technical Report,» arXiv:2303.08774, 2023. [En línea]. Available: https://arxiv.org/abs/2303.08774.</w:t>
+                    </w:r>
+                  </w:p>
+                </w:tc>
+              </w:tr>
+              <w:tr>
+                <w:trPr>
+                  <w:divId w:val="36780032"/>
+                  <w:tblCellSpacing w:w="15" w:type="dxa"/>
+                </w:trPr>
+                <w:tc>
+                  <w:tcPr>
+                    <w:tcW w:w="50" w:type="pct"/>
+                    <w:hideMark/>
+                  </w:tcPr>
+                  <w:p>
+                    <w:pPr>
+                      <w:pStyle w:val="Bibliografa"/>
+                      <w:rPr>
+                        <w:noProof/>
+                      </w:rPr>
+                    </w:pPr>
+                    <w:r>
+                      <w:rPr>
+                        <w:noProof/>
+                      </w:rPr>
+                      <w:t xml:space="preserve">[17] </w:t>
+                    </w:r>
+                  </w:p>
+                </w:tc>
+                <w:tc>
+                  <w:tcPr>
+                    <w:tcW w:w="0" w:type="auto"/>
+                    <w:hideMark/>
+                  </w:tcPr>
+                  <w:p>
+                    <w:pPr>
+                      <w:pStyle w:val="Bibliografa"/>
+                      <w:rPr>
+                        <w:noProof/>
+                      </w:rPr>
+                    </w:pPr>
+                    <w:r>
+                      <w:rPr>
+                        <w:noProof/>
+                      </w:rPr>
+                      <w:t>S. D. F. M. van den Burg y T. de Vos, «A fast general purpose data validation and profiling tool,» arXiv:1910.15327, 2019. [En línea]. Available: https://arxiv.org/abs/1910.15327.</w:t>
+                    </w:r>
+                  </w:p>
+                </w:tc>
+              </w:tr>
+              <w:tr>
+                <w:trPr>
+                  <w:divId w:val="36780032"/>
+                  <w:tblCellSpacing w:w="15" w:type="dxa"/>
+                </w:trPr>
+                <w:tc>
+                  <w:tcPr>
+                    <w:tcW w:w="50" w:type="pct"/>
+                    <w:hideMark/>
+                  </w:tcPr>
+                  <w:p>
+                    <w:pPr>
+                      <w:pStyle w:val="Bibliografa"/>
+                      <w:rPr>
+                        <w:noProof/>
+                      </w:rPr>
+                    </w:pPr>
+                    <w:r>
+                      <w:rPr>
+                        <w:noProof/>
+                      </w:rPr>
+                      <w:t xml:space="preserve">[18] </w:t>
+                    </w:r>
+                  </w:p>
+                </w:tc>
+                <w:tc>
+                  <w:tcPr>
+                    <w:tcW w:w="0" w:type="auto"/>
+                    <w:hideMark/>
+                  </w:tcPr>
+                  <w:p>
+                    <w:pPr>
+                      <w:pStyle w:val="Bibliografa"/>
+                      <w:rPr>
+                        <w:noProof/>
+                      </w:rPr>
+                    </w:pPr>
+                    <w:r>
+                      <w:rPr>
+                        <w:noProof/>
+                      </w:rPr>
+                      <w:t>Deepchecks Team, «Deepchecks: Testing and validating ML models and data,» 2021. [En línea]. Available: https://deepchecks.com.</w:t>
+                    </w:r>
+                  </w:p>
+                </w:tc>
+              </w:tr>
+              <w:tr>
+                <w:trPr>
+                  <w:divId w:val="36780032"/>
+                  <w:tblCellSpacing w:w="15" w:type="dxa"/>
+                </w:trPr>
+                <w:tc>
+                  <w:tcPr>
+                    <w:tcW w:w="50" w:type="pct"/>
+                    <w:hideMark/>
+                  </w:tcPr>
+                  <w:p>
+                    <w:pPr>
+                      <w:pStyle w:val="Bibliografa"/>
+                      <w:rPr>
+                        <w:noProof/>
+                      </w:rPr>
+                    </w:pPr>
+                    <w:r>
+                      <w:rPr>
+                        <w:noProof/>
+                      </w:rPr>
+                      <w:t xml:space="preserve">[19] </w:t>
+                    </w:r>
+                  </w:p>
+                </w:tc>
+                <w:tc>
+                  <w:tcPr>
+                    <w:tcW w:w="0" w:type="auto"/>
+                    <w:hideMark/>
+                  </w:tcPr>
+                  <w:p>
+                    <w:pPr>
+                      <w:pStyle w:val="Bibliografa"/>
+                      <w:rPr>
+                        <w:noProof/>
+                      </w:rPr>
+                    </w:pPr>
+                    <w:r>
+                      <w:rPr>
+                        <w:noProof/>
+                      </w:rPr>
+                      <w:t>A. Campbell y B. Ulery, «Great Expectations: Always know what to expect from your data,» 2019. [En línea]. Available: https://greatexpectations.io.</w:t>
+                    </w:r>
+                  </w:p>
+                </w:tc>
+              </w:tr>
             </w:tbl>
             <w:p>
               <w:pPr>
@@ -11712,7 +15895,7 @@
           <w:rFonts w:cstheme="minorHAnsi"/>
           <w:lang w:val="es-ES"/>
         </w:rPr>
-        <w:t>Breve descripción del contexto del proyecto, objetivos, necesidades que pretende cubrir o problemas que pretende resolver, centrándose en su relación con los temas sociales, económicos, éticos, legales y/o ambientales que se hayan identificado.</w:t>
+        <w:t>Este Trabajo Fin de Máster desarrolla ml-framework, un sistema de código abierto para la evaluación automática de la calidad de conjuntos de datos y la detección de fuga de datos (data leakage) en proyectos de aprendizaje automático. El proyecto surge de la necesidad, cada vez más extendida en la industria y la investigación, de auditar de forma sistemática los datos utilizados para entrenar modelos de ML antes de invertir tiempo y recursos computacionales en su entrenamiento, evitando así que decisiones automatizadas —en ámbitos como la sanidad, las finanzas o la selección de personal— se basen en modelos cuyo rendimiento aparente es un artefacto de problemas de calidad de los datos o de fuga de información. El proyecto está estrechamente relacionado con cuestiones éticas (equidad y transparencia de los modelos de ML), económicas (coste de re-entrenar o retirar modelos defectuosos ya desplegados) y sociales (confianza pública en sistemas automatizados que afectan a personas).</w:t>
       </w:r>
     </w:p>
     <w:p>
@@ -11752,7 +15935,7 @@
           <w:rFonts w:cstheme="minorHAnsi"/>
           <w:lang w:val="es-ES"/>
         </w:rPr>
-        <w:t xml:space="preserve">Síntesis del trabajo realizado en la fase 2, de selección y descripción de impactos. Presentar y justificar las conclusiones a las que se haya llegado sobre cuáles son los asuntos más relevantes relacionados con la sostenibilidad social, económica o ambiental, así como los principales grupos de interés identificados y que se han considerado en los análisis posteriores. </w:t>
+        <w:t>De los posibles impactos del proyecto, se han identificado como más relevantes los de carácter ético-social y económico. En el plano ético-social, un modelo de ML entrenado sobre datos de baja calidad o afectados por fuga de información puede producir predicciones sesgadas o injustificadamente optimistas que, al desplegarse en producción, perjudiquen a las personas afectadas por sus decisiones (por ejemplo, en la concesión de créditos —caso German Credit— o en la priorización de pacientes —escenarios de tipo ICU—). La detección automática de estos problemas antes del entrenamiento contribuye directamente a la transparencia y a la fiabilidad de los sistemas de IA, alineándose con los principios de IA responsable promovidos por la Unión Europea (AI Act) y por organizaciones como NIST. En el plano económico, el coste de detectar un problema de calidad de datos o de fuga de información en fase de auditoría previa es órdenes de magnitud inferior al coste de re-entrenar, re-validar o retirar un modelo ya desplegado en producción que ha demostrado un rendimiento real muy inferior al esperado. Los principales grupos de interés identificados son: (i) los equipos de ciencia de datos y MLOps, que obtienen una herramienta de auditoría automatizada e integrable en sus pipelines (CLI, SDK, plugins); (ii) las organizaciones que despliegan modelos de ML en producción, que reducen el riesgo de incidentes derivados de datos defectuosos; y (iii) los usuarios finales afectados por las decisiones de dichos modelos, que se benefician indirectamente de una mayor fiabilidad. El impacto ambiental del proyecto es indirecto pero no despreciable: al detectar problemas de los datos antes del entrenamiento, el framework puede evitar ciclos innecesarios de entrenamiento de modelos —incluyendo modelos de gran tamaño como XGBoost sobre conjuntos de datos de decenas de miles de filas—, reduciendo el consumo computacional y energético asociado.</w:t>
       </w:r>
     </w:p>
     <w:p>
@@ -11792,7 +15975,7 @@
           <w:rFonts w:cstheme="minorHAnsi"/>
           <w:lang w:val="es-ES"/>
         </w:rPr>
-        <w:t xml:space="preserve">Síntesis del trabajo de análisis realizado. </w:t>
+        <w:t>Se profundiza a continuación en el impacto ético-social derivado de la fuga de datos (data leakage), por ser el de mayor relevancia y el menos conocido fuera del ámbito técnico. La fuga de datos se produce cuando información que no estaría disponible en el momento de la predicción se filtra, de forma inadvertida, en el proceso de entrenamiento, inflando artificialmente las métricas de evaluación. Este fenómeno es especialmente peligroso porque es invisible durante la validación estándar del modelo: un modelo afectado por fuga de datos puede mostrar una precisión cercana al 100% en el conjunto de test y, sin embargo, fallar de forma sistemática al desplegarse con datos reales, momento en el que la información filtrada ya no está disponible. En el caso de estudio del conjunto Titanic analizado en este trabajo (Capítulo 3), la columna boat (bote salvavidas asignado) presenta una correlación de 0.97 con la variable objetivo survived, porque dicha asignación solo se conoce después de conocerse el desenlace. Si un modelo de este tipo se utilizara —de forma análoga— en un contexto real, por ejemplo para priorizar la atención médica de pacientes a partir de variables registradas durante o después del tratamiento, el resultado sería un sistema que parece extremadamente preciso en desarrollo pero que no aporta ningún valor predictivo real en el momento en que se necesita la predicción, es decir, antes de que ocurra el evento. Las consecuencias de desplegar un sistema así pueden ser graves: decisiones automatizadas erróneas en contextos sensibles (sanidad, crédito, selección de personal), pérdida de confianza en los sistemas de IA por parte de usuarios y reguladores, y costes económicos derivados de la retirada y el re-entrenamiento del sistema. ml-framework aborda este impacto proporcionando, de forma automatizada y antes de cualquier entrenamiento, una puntuación interpretable de riesgo de fuga por característica (L(f), Capítulo 2) y un módulo de análisis semántico basado en LLM que detecta casos en los que el riesgo de fuga es evidente a partir del propio nombre o descripción de la variable, incluso cuando las correlaciones estadísticas no lo revelan de forma inmediata.</w:t>
       </w:r>
     </w:p>
     <w:p>
@@ -11833,7 +16016,7 @@
           <w:rFonts w:cstheme="minorHAnsi"/>
           <w:lang w:val="es-ES"/>
         </w:rPr>
-        <w:t>Valorar el proyecto desde un punto de vista ético, social, económico y medioambiental y justificar si el uso de criterios de sostenibilidad ha aportado o puede aportar valor añadido al proyecto.</w:t>
+        <w:t>Desde un punto de vista ético y social, el proyecto contribuye positivamente a la fiabilidad y transparencia de los sistemas de aprendizaje automático, proporcionando una herramienta gratuita y de código abierto que reduce la probabilidad de desplegar modelos cuyo buen rendimiento aparente se deba a problemas de calidad de los datos o a fuga de información, en lugar de a un aprendizaje genuino. Desde el punto de vista económico, automatizar esta auditoría antes del entrenamiento permite detectar problemas en cuestión de segundos —el pipeline completo se ejecuta en menos de diez segundos incluso sobre el conjunto de 48.842 filas de Adult Census Income—, evitando los costes, mucho mayores, de identificar estos problemas una vez el modelo está en producción. Desde el punto de vista ambiental, evitar ciclos de entrenamiento innecesarios sobre datos defectuosos contribuye, de forma modesta pero no nula, a reducir el consumo energético asociado al desarrollo de modelos de ML. En conjunto, se considera que el proyecto presenta un balance claramente positivo en sus dimensiones ética, social, económica y ambiental, sin que se hayan identificado impactos negativos significativos asociados a su desarrollo o a su uso previsto, dado su carácter de herramienta de auditoría —y no de toma de decisiones automatizada— y su disponibilidad pública y gratuita en https://github.com/jaimecano12/ml-framework.</w:t>
       </w:r>
     </w:p>
     <w:p>

</xml_diff>